<commit_message>
Updated file references in handoff document to match new repo structure
</commit_message>
<xml_diff>
--- a/docs/model_manual_v2.docx
+++ b/docs/model_manual_v2.docx
@@ -1391,7 +1391,7 @@
           <w:sz w:val="22"/>
           <w:szCs w:val="22"/>
         </w:rPr>
-        <w:t xml:space="preserve">Run refined_data_setup/_01 through _04 sequentially in BigQuery.</w:t>
+        <w:t xml:space="preserve">Run 01_data_foundation/_01 through _04 sequentially in BigQuery.</w:t>
       </w:r>
     </w:p>
     <w:p>
@@ -5585,7 +5585,7 @@
                 <w:sz w:val="20"/>
                 <w:szCs w:val="20"/>
               </w:rPr>
-              <w:t xml:space="preserve">refined_data_setup/_01_data_setup_members.sql</w:t>
+              <w:t xml:space="preserve">01_data_foundation/_01_data_setup_members.sql</w:t>
             </w:r>
           </w:p>
         </w:tc>
@@ -5670,7 +5670,7 @@
                 <w:sz w:val="20"/>
                 <w:szCs w:val="20"/>
               </w:rPr>
-              <w:t xml:space="preserve">refined_data_setup/_02_data_setup_visits.sql</w:t>
+              <w:t xml:space="preserve">01_data_foundation/_02_data_setup_visits.sql</w:t>
             </w:r>
           </w:p>
         </w:tc>
@@ -5754,7 +5754,7 @@
                 <w:sz w:val="20"/>
                 <w:szCs w:val="20"/>
               </w:rPr>
-              <w:t xml:space="preserve">refined_data_setup/_03_data_setup_qualified_visits.sql</w:t>
+              <w:t xml:space="preserve">01_data_foundation/_03_data_setup_qualified_visits.sql</w:t>
             </w:r>
           </w:p>
         </w:tc>
@@ -5839,7 +5839,7 @@
                 <w:sz w:val="20"/>
                 <w:szCs w:val="20"/>
               </w:rPr>
-              <w:t xml:space="preserve">refined_data_setup/_04_visit_sequences.sql</w:t>
+              <w:t xml:space="preserve">01_data_foundation/_04_visit_sequences.sql</w:t>
             </w:r>
           </w:p>
         </w:tc>
@@ -6060,7 +6060,7 @@
                 <w:sz w:val="20"/>
                 <w:szCs w:val="20"/>
               </w:rPr>
-              <w:t xml:space="preserve">Model_data_setup/Model_data_setup_01.sql</w:t>
+              <w:t xml:space="preserve">02_specialty_preprocessing/Model_data_setup_01.sql</w:t>
             </w:r>
           </w:p>
         </w:tc>
@@ -6145,7 +6145,7 @@
                 <w:sz w:val="20"/>
                 <w:szCs w:val="20"/>
               </w:rPr>
-              <w:t xml:space="preserve">Model_data_setup/Model_sampling.sql</w:t>
+              <w:t xml:space="preserve">02_specialty_preprocessing/Model_sampling.sql</w:t>
             </w:r>
           </w:p>
         </w:tc>
@@ -6229,7 +6229,7 @@
                 <w:sz w:val="20"/>
                 <w:szCs w:val="20"/>
               </w:rPr>
-              <w:t xml:space="preserve">Model_data_setup/Model_train_test_split.sql</w:t>
+              <w:t xml:space="preserve">02_specialty_preprocessing/Model_train_test_split.sql</w:t>
             </w:r>
           </w:p>
         </w:tc>
@@ -6314,7 +6314,7 @@
                 <w:sz w:val="20"/>
                 <w:szCs w:val="20"/>
               </w:rPr>
-              <w:t xml:space="preserve">Model_data_setup/model_input_sequence_data.sql</w:t>
+              <w:t xml:space="preserve">02_specialty_preprocessing/model_input_sequence_data.sql</w:t>
             </w:r>
           </w:p>
         </w:tc>
@@ -9322,7 +9322,7 @@
           <w:sz w:val="22"/>
           <w:szCs w:val="22"/>
         </w:rPr>
-        <w:t xml:space="preserve">Four SQL scripts in refined_data_setup/ transform raw claims into model-ready tables. Run sequentially — each depends on the prior.</w:t>
+        <w:t xml:space="preserve">Four SQL scripts in 01_data_foundation/ transform raw claims into model-ready tables. Run sequentially — each depends on the prior.</w:t>
       </w:r>
     </w:p>
     <w:p>

</xml_diff>

<commit_message>
Updated roadmap: 3 priorities with detailed RL reward layer plan
</commit_message>
<xml_diff>
--- a/docs/model_manual_v2.docx
+++ b/docs/model_manual_v2.docx
@@ -1965,7 +1965,7 @@
                 <w:sz w:val="20"/>
                 <w:szCs w:val="20"/>
               </w:rPr>
-              <w:t xml:space="preserve">Recurrence triggers (same dx after 12m gap)</w:t>
+              <w:t xml:space="preserve">RL reward layer on top of HSTU</w:t>
             </w:r>
           </w:p>
         </w:tc>
@@ -1992,7 +1992,7 @@
                 <w:sz w:val="20"/>
                 <w:szCs w:val="20"/>
               </w:rPr>
-              <w:t xml:space="preserve">2-3x larger trigger population</w:t>
+              <w:t xml:space="preserve">Clinically optimized routing (not just predictive accuracy)</w:t>
             </w:r>
           </w:p>
         </w:tc>
@@ -2019,7 +2019,263 @@
                 <w:sz w:val="20"/>
                 <w:szCs w:val="20"/>
               </w:rPr>
-              <w:t xml:space="preserve">Low — SQL change in _03</w:t>
+              <w:t xml:space="preserve">High — new loss function + clinical SME validation</w:t>
+            </w:r>
+          </w:p>
+        </w:tc>
+      </w:tr>
+    </w:tbl>
+    <w:p>
+      <w:pPr>
+        <w:spacing w:after="80"/>
+      </w:pPr>
+    </w:p>
+    <w:p>
+      <w:pPr>
+        <w:pStyle w:val="Heading3"/>
+        <w:spacing w:after="120" w:before="200"/>
+      </w:pPr>
+      <w:r>
+        <w:rPr>
+          <w:rFonts w:ascii="Arial" w:cs="Arial" w:eastAsia="Arial" w:hAnsi="Arial"/>
+          <w:b/>
+          <w:bCs/>
+          <w:sz w:val="24"/>
+          <w:szCs w:val="24"/>
+        </w:rPr>
+        <w:t xml:space="preserve">Priority 1 — Full-Population Training</w:t>
+      </w:r>
+    </w:p>
+    <w:p>
+      <w:pPr>
+        <w:spacing w:after="120"/>
+      </w:pPr>
+      <w:r>
+        <w:rPr>
+          <w:rFonts w:ascii="Arial" w:cs="Arial" w:eastAsia="Arial" w:hAnsi="Arial"/>
+          <w:sz w:val="22"/>
+          <w:szCs w:val="22"/>
+        </w:rPr>
+        <w:t xml:space="preserve">Current models train on a 5% stratified sample. Scaling to 100% requires no code changes — only compute scaling. The sampling SQL (Model_sampling.sql) and train/test split SQL (Model_train_test_split.sql) already support full population via the sample_members table bypass. Expected outcome: richer transition evidence for low-volume dx codes where the model currently struggles. Primary bottleneck: GPU memory for larger batches and BQ scan costs for full sequence materialization.</w:t>
+      </w:r>
+    </w:p>
+    <w:p>
+      <w:pPr>
+        <w:spacing w:after="80"/>
+      </w:pPr>
+    </w:p>
+    <w:p>
+      <w:pPr>
+        <w:pStyle w:val="Heading3"/>
+        <w:spacing w:after="120" w:before="200"/>
+      </w:pPr>
+      <w:r>
+        <w:rPr>
+          <w:rFonts w:ascii="Arial" w:cs="Arial" w:eastAsia="Arial" w:hAnsi="Arial"/>
+          <w:b/>
+          <w:bCs/>
+          <w:sz w:val="24"/>
+          <w:szCs w:val="24"/>
+        </w:rPr>
+        <w:t xml:space="preserve">Priority 2 — Member Profile Embedding</w:t>
+      </w:r>
+    </w:p>
+    <w:p>
+      <w:pPr>
+        <w:spacing w:after="120"/>
+      </w:pPr>
+      <w:r>
+        <w:rPr>
+          <w:rFonts w:ascii="Arial" w:cs="Arial" w:eastAsia="Arial" w:hAnsi="Arial"/>
+          <w:sz w:val="22"/>
+          <w:szCs w:val="22"/>
+        </w:rPr>
+        <w:t xml:space="preserve">Current models use visit sequence + trigger dx only. Adding a member profile embedding (128-dim vector from age bucket, gender, chronic condition flags, enrollment duration) would extend the visit token from 128 to 256 dimensions. Implementation: (1) create a member_profile_snapshot table with binary chronic condition flags from 12-month claims history, (2) add a profile embedding layer to the model, (3) concatenate to visit token before HSTU blocks. The rl_labels tables already created in Model_data_setup_01.sql were designed to support this extension.</w:t>
+      </w:r>
+    </w:p>
+    <w:p>
+      <w:pPr>
+        <w:spacing w:after="80"/>
+      </w:pPr>
+    </w:p>
+    <w:p>
+      <w:pPr>
+        <w:pStyle w:val="Heading3"/>
+        <w:spacing w:after="120" w:before="200"/>
+      </w:pPr>
+      <w:r>
+        <w:rPr>
+          <w:rFonts w:ascii="Arial" w:cs="Arial" w:eastAsia="Arial" w:hAnsi="Arial"/>
+          <w:b/>
+          <w:bCs/>
+          <w:sz w:val="24"/>
+          <w:szCs w:val="24"/>
+        </w:rPr>
+        <w:t xml:space="preserve">Priority 3 — RL Reward Layer (Detailed Roadmap)</w:t>
+      </w:r>
+    </w:p>
+    <w:p>
+      <w:pPr>
+        <w:spacing w:after="120"/>
+      </w:pPr>
+      <w:r>
+        <w:rPr>
+          <w:rFonts w:ascii="Arial" w:cs="Arial" w:eastAsia="Arial" w:hAnsi="Arial"/>
+          <w:sz w:val="22"/>
+          <w:szCs w:val="22"/>
+        </w:rPr>
+        <w:t xml:space="preserve">This is the transformative improvement. The current system predicts where a member WILL go. An RL layer shifts to recommending where the member SHOULD go — optimizing for clinical quality and network value, not just historical pattern matching.</w:t>
+      </w:r>
+    </w:p>
+    <w:p>
+      <w:pPr>
+        <w:spacing w:after="80"/>
+      </w:pPr>
+    </w:p>
+    <w:p>
+      <w:pPr>
+        <w:spacing w:after="120"/>
+      </w:pPr>
+      <w:r>
+        <w:rPr>
+          <w:rFonts w:ascii="Arial" w:cs="Arial" w:eastAsia="Arial" w:hAnsi="Arial"/>
+          <w:b/>
+          <w:bCs/>
+          <w:sz w:val="22"/>
+          <w:szCs w:val="22"/>
+        </w:rPr>
+        <w:t xml:space="preserve">Phase 3.1 — Reward Function Design (2-3 weeks)</w:t>
+      </w:r>
+    </w:p>
+    <w:p>
+      <w:pPr>
+        <w:spacing w:after="120"/>
+      </w:pPr>
+      <w:r>
+        <w:rPr>
+          <w:rFonts w:ascii="Arial" w:cs="Arial" w:eastAsia="Arial" w:hAnsi="Arial"/>
+          <w:sz w:val="22"/>
+          <w:szCs w:val="22"/>
+        </w:rPr>
+        <w:t xml:space="preserve">Define a composite reward signal that scores each predicted provider along three axes:</w:t>
+      </w:r>
+    </w:p>
+    <w:p>
+      <w:pPr>
+        <w:spacing w:after="80"/>
+      </w:pPr>
+    </w:p>
+    <w:tbl>
+      <w:tblPr>
+        <w:tblW w:type="dxa" w:w="9360"/>
+        <w:tblBorders>
+          <w:top w:val="single" w:color="auto" w:sz="4"/>
+          <w:left w:val="single" w:color="auto" w:sz="4"/>
+          <w:bottom w:val="single" w:color="auto" w:sz="4"/>
+          <w:right w:val="single" w:color="auto" w:sz="4"/>
+          <w:insideH w:val="single" w:color="auto" w:sz="4"/>
+          <w:insideV w:val="single" w:color="auto" w:sz="4"/>
+        </w:tblBorders>
+      </w:tblPr>
+      <w:tblGrid>
+        <w:gridCol w:w="2500"/>
+        <w:gridCol w:w="4500"/>
+        <w:gridCol w:w="2360"/>
+      </w:tblGrid>
+      <w:tr>
+        <w:trPr>
+          <w:tblHeader/>
+        </w:trPr>
+        <w:tc>
+          <w:tcPr>
+            <w:tcW w:type="dxa" w:w="2500"/>
+            <w:tcBorders>
+              <w:top w:val="single" w:color="CCCCCC" w:sz="1"/>
+              <w:left w:val="single" w:color="CCCCCC" w:sz="1"/>
+              <w:bottom w:val="single" w:color="CCCCCC" w:sz="1"/>
+              <w:right w:val="single" w:color="CCCCCC" w:sz="1"/>
+            </w:tcBorders>
+            <w:shd w:fill="2B579A" w:val="clear"/>
+            <w:tcMar>
+              <w:top w:type="dxa" w:w="60"/>
+              <w:left w:type="dxa" w:w="100"/>
+              <w:bottom w:type="dxa" w:w="60"/>
+              <w:right w:type="dxa" w:w="100"/>
+            </w:tcMar>
+          </w:tcPr>
+          <w:p>
+            <w:r>
+              <w:rPr>
+                <w:rFonts w:ascii="Arial" w:cs="Arial" w:eastAsia="Arial" w:hAnsi="Arial"/>
+                <w:b/>
+                <w:bCs/>
+                <w:color w:val="FFFFFF"/>
+                <w:sz w:val="20"/>
+                <w:szCs w:val="20"/>
+              </w:rPr>
+              <w:t xml:space="preserve">Reward Component</w:t>
+            </w:r>
+          </w:p>
+        </w:tc>
+        <w:tc>
+          <w:tcPr>
+            <w:tcW w:type="dxa" w:w="4500"/>
+            <w:tcBorders>
+              <w:top w:val="single" w:color="CCCCCC" w:sz="1"/>
+              <w:left w:val="single" w:color="CCCCCC" w:sz="1"/>
+              <w:bottom w:val="single" w:color="CCCCCC" w:sz="1"/>
+              <w:right w:val="single" w:color="CCCCCC" w:sz="1"/>
+            </w:tcBorders>
+            <w:shd w:fill="2B579A" w:val="clear"/>
+            <w:tcMar>
+              <w:top w:type="dxa" w:w="60"/>
+              <w:left w:type="dxa" w:w="100"/>
+              <w:bottom w:type="dxa" w:w="60"/>
+              <w:right w:type="dxa" w:w="100"/>
+            </w:tcMar>
+          </w:tcPr>
+          <w:p>
+            <w:r>
+              <w:rPr>
+                <w:rFonts w:ascii="Arial" w:cs="Arial" w:eastAsia="Arial" w:hAnsi="Arial"/>
+                <w:b/>
+                <w:bCs/>
+                <w:color w:val="FFFFFF"/>
+                <w:sz w:val="20"/>
+                <w:szCs w:val="20"/>
+              </w:rPr>
+              <w:t xml:space="preserve">Signal Source</w:t>
+            </w:r>
+          </w:p>
+        </w:tc>
+        <w:tc>
+          <w:tcPr>
+            <w:tcW w:type="dxa" w:w="2360"/>
+            <w:tcBorders>
+              <w:top w:val="single" w:color="CCCCCC" w:sz="1"/>
+              <w:left w:val="single" w:color="CCCCCC" w:sz="1"/>
+              <w:bottom w:val="single" w:color="CCCCCC" w:sz="1"/>
+              <w:right w:val="single" w:color="CCCCCC" w:sz="1"/>
+            </w:tcBorders>
+            <w:shd w:fill="2B579A" w:val="clear"/>
+            <w:tcMar>
+              <w:top w:type="dxa" w:w="60"/>
+              <w:left w:type="dxa" w:w="100"/>
+              <w:bottom w:type="dxa" w:w="60"/>
+              <w:right w:type="dxa" w:w="100"/>
+            </w:tcMar>
+          </w:tcPr>
+          <w:p>
+            <w:r>
+              <w:rPr>
+                <w:rFonts w:ascii="Arial" w:cs="Arial" w:eastAsia="Arial" w:hAnsi="Arial"/>
+                <w:b/>
+                <w:bCs/>
+                <w:color w:val="FFFFFF"/>
+                <w:sz w:val="20"/>
+                <w:szCs w:val="20"/>
+              </w:rPr>
+              <w:t xml:space="preserve">Weight (initial)</w:t>
             </w:r>
           </w:p>
         </w:tc>
@@ -2027,85 +2283,55 @@
       <w:tr>
         <w:tc>
           <w:tcPr>
-            <w:tcW w:type="dxa" w:w="800"/>
-            <w:tcBorders>
-              <w:top w:val="single" w:color="CCCCCC" w:sz="1"/>
-              <w:left w:val="single" w:color="CCCCCC" w:sz="1"/>
-              <w:bottom w:val="single" w:color="CCCCCC" w:sz="1"/>
-              <w:right w:val="single" w:color="CCCCCC" w:sz="1"/>
-            </w:tcBorders>
-            <w:shd w:fill="F2F2F2" w:val="clear"/>
-            <w:tcMar>
-              <w:top w:type="dxa" w:w="60"/>
-              <w:left w:type="dxa" w:w="100"/>
-              <w:bottom w:type="dxa" w:w="60"/>
-              <w:right w:type="dxa" w:w="100"/>
-            </w:tcMar>
-          </w:tcPr>
-          <w:p>
-            <w:r>
-              <w:rPr>
-                <w:rFonts w:ascii="Arial" w:cs="Arial" w:eastAsia="Arial" w:hAnsi="Arial"/>
-                <w:sz w:val="20"/>
-                <w:szCs w:val="20"/>
-              </w:rPr>
-              <w:t xml:space="preserve">4</w:t>
-            </w:r>
-          </w:p>
-        </w:tc>
-        <w:tc>
-          <w:tcPr>
-            <w:tcW w:type="dxa" w:w="3000"/>
-            <w:tcBorders>
-              <w:top w:val="single" w:color="CCCCCC" w:sz="1"/>
-              <w:left w:val="single" w:color="CCCCCC" w:sz="1"/>
-              <w:bottom w:val="single" w:color="CCCCCC" w:sz="1"/>
-              <w:right w:val="single" w:color="CCCCCC" w:sz="1"/>
-            </w:tcBorders>
-            <w:shd w:fill="F2F2F2" w:val="clear"/>
-            <w:tcMar>
-              <w:top w:type="dxa" w:w="60"/>
-              <w:left w:type="dxa" w:w="100"/>
-              <w:bottom w:type="dxa" w:w="60"/>
-              <w:right w:type="dxa" w:w="100"/>
-            </w:tcMar>
-          </w:tcPr>
-          <w:p>
-            <w:r>
-              <w:rPr>
-                <w:rFonts w:ascii="Arial" w:cs="Arial" w:eastAsia="Arial" w:hAnsi="Arial"/>
-                <w:sz w:val="20"/>
-                <w:szCs w:val="20"/>
-              </w:rPr>
-              <w:t xml:space="preserve">Multi-market expansion</w:t>
-            </w:r>
-          </w:p>
-        </w:tc>
-        <w:tc>
-          <w:tcPr>
-            <w:tcW w:type="dxa" w:w="3200"/>
-            <w:tcBorders>
-              <w:top w:val="single" w:color="CCCCCC" w:sz="1"/>
-              <w:left w:val="single" w:color="CCCCCC" w:sz="1"/>
-              <w:bottom w:val="single" w:color="CCCCCC" w:sz="1"/>
-              <w:right w:val="single" w:color="CCCCCC" w:sz="1"/>
-            </w:tcBorders>
-            <w:shd w:fill="F2F2F2" w:val="clear"/>
-            <w:tcMar>
-              <w:top w:type="dxa" w:w="60"/>
-              <w:left w:type="dxa" w:w="100"/>
-              <w:bottom w:type="dxa" w:w="60"/>
-              <w:right w:type="dxa" w:w="100"/>
-            </w:tcMar>
-          </w:tcPr>
-          <w:p>
-            <w:r>
-              <w:rPr>
-                <w:rFonts w:ascii="Arial" w:cs="Arial" w:eastAsia="Arial" w:hAnsi="Arial"/>
-                <w:sz w:val="20"/>
-                <w:szCs w:val="20"/>
-              </w:rPr>
-              <w:t xml:space="preserve">Generalization beyond South Florida</w:t>
+            <w:tcW w:type="dxa" w:w="2500"/>
+            <w:tcBorders>
+              <w:top w:val="single" w:color="CCCCCC" w:sz="1"/>
+              <w:left w:val="single" w:color="CCCCCC" w:sz="1"/>
+              <w:bottom w:val="single" w:color="CCCCCC" w:sz="1"/>
+              <w:right w:val="single" w:color="CCCCCC" w:sz="1"/>
+            </w:tcBorders>
+            <w:tcMar>
+              <w:top w:type="dxa" w:w="60"/>
+              <w:left w:type="dxa" w:w="100"/>
+              <w:bottom w:type="dxa" w:w="60"/>
+              <w:right w:type="dxa" w:w="100"/>
+            </w:tcMar>
+          </w:tcPr>
+          <w:p>
+            <w:r>
+              <w:rPr>
+                <w:rFonts w:ascii="Arial" w:cs="Arial" w:eastAsia="Arial" w:hAnsi="Arial"/>
+                <w:sz w:val="20"/>
+                <w:szCs w:val="20"/>
+              </w:rPr>
+              <w:t xml:space="preserve">Prediction correctness</w:t>
+            </w:r>
+          </w:p>
+        </w:tc>
+        <w:tc>
+          <w:tcPr>
+            <w:tcW w:type="dxa" w:w="4500"/>
+            <w:tcBorders>
+              <w:top w:val="single" w:color="CCCCCC" w:sz="1"/>
+              <w:left w:val="single" w:color="CCCCCC" w:sz="1"/>
+              <w:bottom w:val="single" w:color="CCCCCC" w:sz="1"/>
+              <w:right w:val="single" w:color="CCCCCC" w:sz="1"/>
+            </w:tcBorders>
+            <w:tcMar>
+              <w:top w:type="dxa" w:w="60"/>
+              <w:left w:type="dxa" w:w="100"/>
+              <w:bottom w:type="dxa" w:w="60"/>
+              <w:right w:type="dxa" w:w="100"/>
+            </w:tcMar>
+          </w:tcPr>
+          <w:p>
+            <w:r>
+              <w:rPr>
+                <w:rFonts w:ascii="Arial" w:cs="Arial" w:eastAsia="Arial" w:hAnsi="Arial"/>
+                <w:sz w:val="20"/>
+                <w:szCs w:val="20"/>
+              </w:rPr>
+              <w:t xml:space="preserve">Was this provider actually visited? (binary from current labels)</w:t>
             </w:r>
           </w:p>
         </w:tc>
@@ -2118,22 +2344,21 @@
               <w:bottom w:val="single" w:color="CCCCCC" w:sz="1"/>
               <w:right w:val="single" w:color="CCCCCC" w:sz="1"/>
             </w:tcBorders>
-            <w:shd w:fill="F2F2F2" w:val="clear"/>
-            <w:tcMar>
-              <w:top w:type="dxa" w:w="60"/>
-              <w:left w:type="dxa" w:w="100"/>
-              <w:bottom w:type="dxa" w:w="60"/>
-              <w:right w:type="dxa" w:w="100"/>
-            </w:tcMar>
-          </w:tcPr>
-          <w:p>
-            <w:r>
-              <w:rPr>
-                <w:rFonts w:ascii="Arial" w:cs="Arial" w:eastAsia="Arial" w:hAnsi="Arial"/>
-                <w:sz w:val="20"/>
-                <w:szCs w:val="20"/>
-              </w:rPr>
-              <w:t xml:space="preserve">High — new data onboarding + retraining</w:t>
+            <w:tcMar>
+              <w:top w:type="dxa" w:w="60"/>
+              <w:left w:type="dxa" w:w="100"/>
+              <w:bottom w:type="dxa" w:w="60"/>
+              <w:right w:type="dxa" w:w="100"/>
+            </w:tcMar>
+          </w:tcPr>
+          <w:p>
+            <w:r>
+              <w:rPr>
+                <w:rFonts w:ascii="Arial" w:cs="Arial" w:eastAsia="Arial" w:hAnsi="Arial"/>
+                <w:sz w:val="20"/>
+                <w:szCs w:val="20"/>
+              </w:rPr>
+              <w:t xml:space="preserve">0.4</w:t>
             </w:r>
           </w:p>
         </w:tc>
@@ -2141,82 +2366,57 @@
       <w:tr>
         <w:tc>
           <w:tcPr>
-            <w:tcW w:type="dxa" w:w="800"/>
-            <w:tcBorders>
-              <w:top w:val="single" w:color="CCCCCC" w:sz="1"/>
-              <w:left w:val="single" w:color="CCCCCC" w:sz="1"/>
-              <w:bottom w:val="single" w:color="CCCCCC" w:sz="1"/>
-              <w:right w:val="single" w:color="CCCCCC" w:sz="1"/>
-            </w:tcBorders>
-            <w:tcMar>
-              <w:top w:type="dxa" w:w="60"/>
-              <w:left w:type="dxa" w:w="100"/>
-              <w:bottom w:type="dxa" w:w="60"/>
-              <w:right w:type="dxa" w:w="100"/>
-            </w:tcMar>
-          </w:tcPr>
-          <w:p>
-            <w:r>
-              <w:rPr>
-                <w:rFonts w:ascii="Arial" w:cs="Arial" w:eastAsia="Arial" w:hAnsi="Arial"/>
-                <w:sz w:val="20"/>
-                <w:szCs w:val="20"/>
-              </w:rPr>
-              <w:t xml:space="preserve">5</w:t>
-            </w:r>
-          </w:p>
-        </w:tc>
-        <w:tc>
-          <w:tcPr>
-            <w:tcW w:type="dxa" w:w="3000"/>
-            <w:tcBorders>
-              <w:top w:val="single" w:color="CCCCCC" w:sz="1"/>
-              <w:left w:val="single" w:color="CCCCCC" w:sz="1"/>
-              <w:bottom w:val="single" w:color="CCCCCC" w:sz="1"/>
-              <w:right w:val="single" w:color="CCCCCC" w:sz="1"/>
-            </w:tcBorders>
-            <w:tcMar>
-              <w:top w:type="dxa" w:w="60"/>
-              <w:left w:type="dxa" w:w="100"/>
-              <w:bottom w:type="dxa" w:w="60"/>
-              <w:right w:type="dxa" w:w="100"/>
-            </w:tcMar>
-          </w:tcPr>
-          <w:p>
-            <w:r>
-              <w:rPr>
-                <w:rFonts w:ascii="Arial" w:cs="Arial" w:eastAsia="Arial" w:hAnsi="Arial"/>
-                <w:sz w:val="20"/>
-                <w:szCs w:val="20"/>
-              </w:rPr>
-              <w:t xml:space="preserve">RL reward layer on top of HSTU</w:t>
-            </w:r>
-          </w:p>
-        </w:tc>
-        <w:tc>
-          <w:tcPr>
-            <w:tcW w:type="dxa" w:w="3200"/>
-            <w:tcBorders>
-              <w:top w:val="single" w:color="CCCCCC" w:sz="1"/>
-              <w:left w:val="single" w:color="CCCCCC" w:sz="1"/>
-              <w:bottom w:val="single" w:color="CCCCCC" w:sz="1"/>
-              <w:right w:val="single" w:color="CCCCCC" w:sz="1"/>
-            </w:tcBorders>
-            <w:tcMar>
-              <w:top w:type="dxa" w:w="60"/>
-              <w:left w:type="dxa" w:w="100"/>
-              <w:bottom w:type="dxa" w:w="60"/>
-              <w:right w:type="dxa" w:w="100"/>
-            </w:tcMar>
-          </w:tcPr>
-          <w:p>
-            <w:r>
-              <w:rPr>
-                <w:rFonts w:ascii="Arial" w:cs="Arial" w:eastAsia="Arial" w:hAnsi="Arial"/>
-                <w:sz w:val="20"/>
-                <w:szCs w:val="20"/>
-              </w:rPr>
-              <w:t xml:space="preserve">Clinically optimized routing (not just predictive accuracy)</w:t>
+            <w:tcW w:type="dxa" w:w="2500"/>
+            <w:tcBorders>
+              <w:top w:val="single" w:color="CCCCCC" w:sz="1"/>
+              <w:left w:val="single" w:color="CCCCCC" w:sz="1"/>
+              <w:bottom w:val="single" w:color="CCCCCC" w:sz="1"/>
+              <w:right w:val="single" w:color="CCCCCC" w:sz="1"/>
+            </w:tcBorders>
+            <w:shd w:fill="F2F2F2" w:val="clear"/>
+            <w:tcMar>
+              <w:top w:type="dxa" w:w="60"/>
+              <w:left w:type="dxa" w:w="100"/>
+              <w:bottom w:type="dxa" w:w="60"/>
+              <w:right w:type="dxa" w:w="100"/>
+            </w:tcMar>
+          </w:tcPr>
+          <w:p>
+            <w:r>
+              <w:rPr>
+                <w:rFonts w:ascii="Arial" w:cs="Arial" w:eastAsia="Arial" w:hAnsi="Arial"/>
+                <w:sz w:val="20"/>
+                <w:szCs w:val="20"/>
+              </w:rPr>
+              <w:t xml:space="preserve">Provider quality score</w:t>
+            </w:r>
+          </w:p>
+        </w:tc>
+        <w:tc>
+          <w:tcPr>
+            <w:tcW w:type="dxa" w:w="4500"/>
+            <w:tcBorders>
+              <w:top w:val="single" w:color="CCCCCC" w:sz="1"/>
+              <w:left w:val="single" w:color="CCCCCC" w:sz="1"/>
+              <w:bottom w:val="single" w:color="CCCCCC" w:sz="1"/>
+              <w:right w:val="single" w:color="CCCCCC" w:sz="1"/>
+            </w:tcBorders>
+            <w:shd w:fill="F2F2F2" w:val="clear"/>
+            <w:tcMar>
+              <w:top w:type="dxa" w:w="60"/>
+              <w:left w:type="dxa" w:w="100"/>
+              <w:bottom w:type="dxa" w:w="60"/>
+              <w:right w:type="dxa" w:w="100"/>
+            </w:tcMar>
+          </w:tcPr>
+          <w:p>
+            <w:r>
+              <w:rPr>
+                <w:rFonts w:ascii="Arial" w:cs="Arial" w:eastAsia="Arial" w:hAnsi="Arial"/>
+                <w:sz w:val="20"/>
+                <w:szCs w:val="20"/>
+              </w:rPr>
+              <w:t xml:space="preserve">Claims-derived quality metrics: readmission rate, cost efficiency, patient volume for this dx</w:t>
             </w:r>
           </w:p>
         </w:tc>
@@ -2229,21 +2429,22 @@
               <w:bottom w:val="single" w:color="CCCCCC" w:sz="1"/>
               <w:right w:val="single" w:color="CCCCCC" w:sz="1"/>
             </w:tcBorders>
-            <w:tcMar>
-              <w:top w:type="dxa" w:w="60"/>
-              <w:left w:type="dxa" w:w="100"/>
-              <w:bottom w:type="dxa" w:w="60"/>
-              <w:right w:type="dxa" w:w="100"/>
-            </w:tcMar>
-          </w:tcPr>
-          <w:p>
-            <w:r>
-              <w:rPr>
-                <w:rFonts w:ascii="Arial" w:cs="Arial" w:eastAsia="Arial" w:hAnsi="Arial"/>
-                <w:sz w:val="20"/>
-                <w:szCs w:val="20"/>
-              </w:rPr>
-              <w:t xml:space="preserve">High — new loss function + clinical SME validation</w:t>
+            <w:shd w:fill="F2F2F2" w:val="clear"/>
+            <w:tcMar>
+              <w:top w:type="dxa" w:w="60"/>
+              <w:left w:type="dxa" w:w="100"/>
+              <w:bottom w:type="dxa" w:w="60"/>
+              <w:right w:type="dxa" w:w="100"/>
+            </w:tcMar>
+          </w:tcPr>
+          <w:p>
+            <w:r>
+              <w:rPr>
+                <w:rFonts w:ascii="Arial" w:cs="Arial" w:eastAsia="Arial" w:hAnsi="Arial"/>
+                <w:sz w:val="20"/>
+                <w:szCs w:val="20"/>
+              </w:rPr>
+              <w:t xml:space="preserve">0.35</w:t>
             </w:r>
           </w:p>
         </w:tc>
@@ -2251,85 +2452,55 @@
       <w:tr>
         <w:tc>
           <w:tcPr>
-            <w:tcW w:type="dxa" w:w="800"/>
-            <w:tcBorders>
-              <w:top w:val="single" w:color="CCCCCC" w:sz="1"/>
-              <w:left w:val="single" w:color="CCCCCC" w:sz="1"/>
-              <w:bottom w:val="single" w:color="CCCCCC" w:sz="1"/>
-              <w:right w:val="single" w:color="CCCCCC" w:sz="1"/>
-            </w:tcBorders>
-            <w:shd w:fill="F2F2F2" w:val="clear"/>
-            <w:tcMar>
-              <w:top w:type="dxa" w:w="60"/>
-              <w:left w:type="dxa" w:w="100"/>
-              <w:bottom w:type="dxa" w:w="60"/>
-              <w:right w:type="dxa" w:w="100"/>
-            </w:tcMar>
-          </w:tcPr>
-          <w:p>
-            <w:r>
-              <w:rPr>
-                <w:rFonts w:ascii="Arial" w:cs="Arial" w:eastAsia="Arial" w:hAnsi="Arial"/>
-                <w:sz w:val="20"/>
-                <w:szCs w:val="20"/>
-              </w:rPr>
-              <w:t xml:space="preserve">6</w:t>
-            </w:r>
-          </w:p>
-        </w:tc>
-        <w:tc>
-          <w:tcPr>
-            <w:tcW w:type="dxa" w:w="3000"/>
-            <w:tcBorders>
-              <w:top w:val="single" w:color="CCCCCC" w:sz="1"/>
-              <w:left w:val="single" w:color="CCCCCC" w:sz="1"/>
-              <w:bottom w:val="single" w:color="CCCCCC" w:sz="1"/>
-              <w:right w:val="single" w:color="CCCCCC" w:sz="1"/>
-            </w:tcBorders>
-            <w:shd w:fill="F2F2F2" w:val="clear"/>
-            <w:tcMar>
-              <w:top w:type="dxa" w:w="60"/>
-              <w:left w:type="dxa" w:w="100"/>
-              <w:bottom w:type="dxa" w:w="60"/>
-              <w:right w:type="dxa" w:w="100"/>
-            </w:tcMar>
-          </w:tcPr>
-          <w:p>
-            <w:r>
-              <w:rPr>
-                <w:rFonts w:ascii="Arial" w:cs="Arial" w:eastAsia="Arial" w:hAnsi="Arial"/>
-                <w:sz w:val="20"/>
-                <w:szCs w:val="20"/>
-              </w:rPr>
-              <w:t xml:space="preserve">Deployment pipeline (MLflow + Vertex AI)</w:t>
-            </w:r>
-          </w:p>
-        </w:tc>
-        <w:tc>
-          <w:tcPr>
-            <w:tcW w:type="dxa" w:w="3200"/>
-            <w:tcBorders>
-              <w:top w:val="single" w:color="CCCCCC" w:sz="1"/>
-              <w:left w:val="single" w:color="CCCCCC" w:sz="1"/>
-              <w:bottom w:val="single" w:color="CCCCCC" w:sz="1"/>
-              <w:right w:val="single" w:color="CCCCCC" w:sz="1"/>
-            </w:tcBorders>
-            <w:shd w:fill="F2F2F2" w:val="clear"/>
-            <w:tcMar>
-              <w:top w:type="dxa" w:w="60"/>
-              <w:left w:type="dxa" w:w="100"/>
-              <w:bottom w:type="dxa" w:w="60"/>
-              <w:right w:type="dxa" w:w="100"/>
-            </w:tcMar>
-          </w:tcPr>
-          <w:p>
-            <w:r>
-              <w:rPr>
-                <w:rFonts w:ascii="Arial" w:cs="Arial" w:eastAsia="Arial" w:hAnsi="Arial"/>
-                <w:sz w:val="20"/>
-                <w:szCs w:val="20"/>
-              </w:rPr>
-              <w:t xml:space="preserve">Operationalize for real-time scoring</w:t>
+            <w:tcW w:type="dxa" w:w="2500"/>
+            <w:tcBorders>
+              <w:top w:val="single" w:color="CCCCCC" w:sz="1"/>
+              <w:left w:val="single" w:color="CCCCCC" w:sz="1"/>
+              <w:bottom w:val="single" w:color="CCCCCC" w:sz="1"/>
+              <w:right w:val="single" w:color="CCCCCC" w:sz="1"/>
+            </w:tcBorders>
+            <w:tcMar>
+              <w:top w:type="dxa" w:w="60"/>
+              <w:left w:type="dxa" w:w="100"/>
+              <w:bottom w:type="dxa" w:w="60"/>
+              <w:right w:type="dxa" w:w="100"/>
+            </w:tcMar>
+          </w:tcPr>
+          <w:p>
+            <w:r>
+              <w:rPr>
+                <w:rFonts w:ascii="Arial" w:cs="Arial" w:eastAsia="Arial" w:hAnsi="Arial"/>
+                <w:sz w:val="20"/>
+                <w:szCs w:val="20"/>
+              </w:rPr>
+              <w:t xml:space="preserve">Network alignment</w:t>
+            </w:r>
+          </w:p>
+        </w:tc>
+        <w:tc>
+          <w:tcPr>
+            <w:tcW w:type="dxa" w:w="4500"/>
+            <w:tcBorders>
+              <w:top w:val="single" w:color="CCCCCC" w:sz="1"/>
+              <w:left w:val="single" w:color="CCCCCC" w:sz="1"/>
+              <w:bottom w:val="single" w:color="CCCCCC" w:sz="1"/>
+              <w:right w:val="single" w:color="CCCCCC" w:sz="1"/>
+            </w:tcBorders>
+            <w:tcMar>
+              <w:top w:type="dxa" w:w="60"/>
+              <w:left w:type="dxa" w:w="100"/>
+              <w:bottom w:type="dxa" w:w="60"/>
+              <w:right w:type="dxa" w:w="100"/>
+            </w:tcMar>
+          </w:tcPr>
+          <w:p>
+            <w:r>
+              <w:rPr>
+                <w:rFonts w:ascii="Arial" w:cs="Arial" w:eastAsia="Arial" w:hAnsi="Arial"/>
+                <w:sz w:val="20"/>
+                <w:szCs w:val="20"/>
+              </w:rPr>
+              <w:t xml:space="preserve">Is this provider in-network, preferred tier, or part of a value-based arrangement?</w:t>
             </w:r>
           </w:p>
         </w:tc>
@@ -2342,22 +2513,601 @@
               <w:bottom w:val="single" w:color="CCCCCC" w:sz="1"/>
               <w:right w:val="single" w:color="CCCCCC" w:sz="1"/>
             </w:tcBorders>
-            <w:shd w:fill="F2F2F2" w:val="clear"/>
-            <w:tcMar>
-              <w:top w:type="dxa" w:w="60"/>
-              <w:left w:type="dxa" w:w="100"/>
-              <w:bottom w:type="dxa" w:w="60"/>
-              <w:right w:type="dxa" w:w="100"/>
-            </w:tcMar>
-          </w:tcPr>
-          <w:p>
-            <w:r>
-              <w:rPr>
-                <w:rFonts w:ascii="Arial" w:cs="Arial" w:eastAsia="Arial" w:hAnsi="Arial"/>
-                <w:sz w:val="20"/>
-                <w:szCs w:val="20"/>
-              </w:rPr>
-              <w:t xml:space="preserve">High — infrastructure</w:t>
+            <w:tcMar>
+              <w:top w:type="dxa" w:w="60"/>
+              <w:left w:type="dxa" w:w="100"/>
+              <w:bottom w:type="dxa" w:w="60"/>
+              <w:right w:type="dxa" w:w="100"/>
+            </w:tcMar>
+          </w:tcPr>
+          <w:p>
+            <w:r>
+              <w:rPr>
+                <w:rFonts w:ascii="Arial" w:cs="Arial" w:eastAsia="Arial" w:hAnsi="Arial"/>
+                <w:sz w:val="20"/>
+                <w:szCs w:val="20"/>
+              </w:rPr>
+              <w:t xml:space="preserve">0.25</w:t>
+            </w:r>
+          </w:p>
+        </w:tc>
+      </w:tr>
+    </w:tbl>
+    <w:p>
+      <w:pPr>
+        <w:spacing w:after="80"/>
+      </w:pPr>
+    </w:p>
+    <w:p>
+      <w:pPr>
+        <w:spacing w:after="120"/>
+      </w:pPr>
+      <w:r>
+        <w:rPr>
+          <w:rFonts w:ascii="Arial" w:cs="Arial" w:eastAsia="Arial" w:hAnsi="Arial"/>
+          <w:sz w:val="22"/>
+          <w:szCs w:val="22"/>
+        </w:rPr>
+        <w:t xml:space="preserve">Reward = w1 * correctness + w2 * quality_score + w3 * network_alignment. Weights tuned via grid search with clinical SME sign-off on a holdout set.</w:t>
+      </w:r>
+    </w:p>
+    <w:p>
+      <w:pPr>
+        <w:spacing w:after="80"/>
+      </w:pPr>
+    </w:p>
+    <w:p>
+      <w:pPr>
+        <w:spacing w:after="120"/>
+      </w:pPr>
+      <w:r>
+        <w:rPr>
+          <w:rFonts w:ascii="Arial" w:cs="Arial" w:eastAsia="Arial" w:hAnsi="Arial"/>
+          <w:b/>
+          <w:bCs/>
+          <w:sz w:val="22"/>
+          <w:szCs w:val="22"/>
+        </w:rPr>
+        <w:t xml:space="preserve">Deliverable: </w:t>
+      </w:r>
+      <w:r>
+        <w:rPr>
+          <w:rFonts w:ascii="Arial" w:cs="Arial" w:eastAsia="Arial" w:hAnsi="Arial"/>
+          <w:sz w:val="22"/>
+          <w:szCs w:val="22"/>
+        </w:rPr>
+        <w:t xml:space="preserve">Reward function specification document + quality score table in BQ.</w:t>
+      </w:r>
+    </w:p>
+    <w:p>
+      <w:pPr>
+        <w:spacing w:after="80"/>
+      </w:pPr>
+    </w:p>
+    <w:p>
+      <w:pPr>
+        <w:spacing w:after="120"/>
+      </w:pPr>
+      <w:r>
+        <w:rPr>
+          <w:rFonts w:ascii="Arial" w:cs="Arial" w:eastAsia="Arial" w:hAnsi="Arial"/>
+          <w:b/>
+          <w:bCs/>
+          <w:sz w:val="22"/>
+          <w:szCs w:val="22"/>
+        </w:rPr>
+        <w:t xml:space="preserve">Phase 3.2 — Data Pipeline for Reward Signals (2 weeks)</w:t>
+      </w:r>
+    </w:p>
+    <w:p>
+      <w:pPr>
+        <w:spacing w:after="120"/>
+      </w:pPr>
+      <w:r>
+        <w:rPr>
+          <w:rFonts w:ascii="Arial" w:cs="Arial" w:eastAsia="Arial" w:hAnsi="Arial"/>
+          <w:sz w:val="22"/>
+          <w:szCs w:val="22"/>
+        </w:rPr>
+        <w:t xml:space="preserve">The rl_labels_train/test tables already exist (created by Model_data_setup_01.sql) with provider-level labels per trigger. Extend these with:</w:t>
+      </w:r>
+    </w:p>
+    <w:p>
+      <w:pPr>
+        <w:spacing w:after="80"/>
+      </w:pPr>
+    </w:p>
+    <w:p>
+      <w:pPr>
+        <w:spacing w:after="120"/>
+      </w:pPr>
+      <w:r>
+        <w:rPr>
+          <w:rFonts w:ascii="Arial" w:cs="Arial" w:eastAsia="Arial" w:hAnsi="Arial"/>
+          <w:b/>
+          <w:bCs/>
+          <w:sz w:val="22"/>
+          <w:szCs w:val="22"/>
+        </w:rPr>
+        <w:t xml:space="preserve">Provider quality table: </w:t>
+      </w:r>
+      <w:r>
+        <w:rPr>
+          <w:rFonts w:ascii="Arial" w:cs="Arial" w:eastAsia="Arial" w:hAnsi="Arial"/>
+          <w:sz w:val="22"/>
+          <w:szCs w:val="22"/>
+        </w:rPr>
+        <w:t xml:space="preserve">Per (srv_prvdr_id, dx_clean): 30-day readmission rate, avg allowed_amt vs specialty median, patient volume (claims count). Derived from _sfl with a 12-month lookback. One-time BQ job.</w:t>
+      </w:r>
+    </w:p>
+    <w:p>
+      <w:pPr>
+        <w:spacing w:after="120"/>
+      </w:pPr>
+      <w:r>
+        <w:rPr>
+          <w:rFonts w:ascii="Arial" w:cs="Arial" w:eastAsia="Arial" w:hAnsi="Arial"/>
+          <w:b/>
+          <w:bCs/>
+          <w:sz w:val="22"/>
+          <w:szCs w:val="22"/>
+        </w:rPr>
+        <w:t xml:space="preserve">Network tier table: </w:t>
+      </w:r>
+      <w:r>
+        <w:rPr>
+          <w:rFonts w:ascii="Arial" w:cs="Arial" w:eastAsia="Arial" w:hAnsi="Arial"/>
+          <w:sz w:val="22"/>
+          <w:szCs w:val="22"/>
+        </w:rPr>
+        <w:t xml:space="preserve">Per srv_prvdr_id: in-network flag, tier (preferred/standard/out), value-based contract flag. Source: provider directory or network configuration tables (external to this repo).</w:t>
+      </w:r>
+    </w:p>
+    <w:p>
+      <w:pPr>
+        <w:spacing w:after="120"/>
+      </w:pPr>
+      <w:r>
+        <w:rPr>
+          <w:rFonts w:ascii="Arial" w:cs="Arial" w:eastAsia="Arial" w:hAnsi="Arial"/>
+          <w:b/>
+          <w:bCs/>
+          <w:sz w:val="22"/>
+          <w:szCs w:val="22"/>
+        </w:rPr>
+        <w:t xml:space="preserve">Reward labels table: </w:t>
+      </w:r>
+      <w:r>
+        <w:rPr>
+          <w:rFonts w:ascii="Arial" w:cs="Arial" w:eastAsia="Arial" w:hAnsi="Arial"/>
+          <w:sz w:val="22"/>
+          <w:szCs w:val="22"/>
+        </w:rPr>
+        <w:t xml:space="preserve">Join rl_labels to quality + tier tables. Compute composite reward per (trigger, downstream_provider). One row per trigger + provider + time_bucket with reward float.</w:t>
+      </w:r>
+    </w:p>
+    <w:p>
+      <w:pPr>
+        <w:spacing w:after="80"/>
+      </w:pPr>
+    </w:p>
+    <w:p>
+      <w:pPr>
+        <w:spacing w:after="120"/>
+      </w:pPr>
+      <w:r>
+        <w:rPr>
+          <w:rFonts w:ascii="Arial" w:cs="Arial" w:eastAsia="Arial" w:hAnsi="Arial"/>
+          <w:b/>
+          <w:bCs/>
+          <w:sz w:val="22"/>
+          <w:szCs w:val="22"/>
+        </w:rPr>
+        <w:t xml:space="preserve">Deliverable: </w:t>
+      </w:r>
+      <w:r>
+        <w:rPr>
+          <w:rFonts w:ascii="Arial" w:cs="Arial" w:eastAsia="Arial" w:hAnsi="Arial"/>
+          <w:sz w:val="22"/>
+          <w:szCs w:val="22"/>
+        </w:rPr>
+        <w:t xml:space="preserve">3 new BQ tables + reward computation SQL.</w:t>
+      </w:r>
+    </w:p>
+    <w:p>
+      <w:pPr>
+        <w:spacing w:after="80"/>
+      </w:pPr>
+    </w:p>
+    <w:p>
+      <w:pPr>
+        <w:spacing w:after="120"/>
+      </w:pPr>
+      <w:r>
+        <w:rPr>
+          <w:rFonts w:ascii="Arial" w:cs="Arial" w:eastAsia="Arial" w:hAnsi="Arial"/>
+          <w:b/>
+          <w:bCs/>
+          <w:sz w:val="22"/>
+          <w:szCs w:val="22"/>
+        </w:rPr>
+        <w:t xml:space="preserve">Phase 3.3 — Model Architecture (3-4 weeks)</w:t>
+      </w:r>
+    </w:p>
+    <w:p>
+      <w:pPr>
+        <w:spacing w:after="120"/>
+      </w:pPr>
+      <w:r>
+        <w:rPr>
+          <w:rFonts w:ascii="Arial" w:cs="Arial" w:eastAsia="Arial" w:hAnsi="Arial"/>
+          <w:sz w:val="22"/>
+          <w:szCs w:val="22"/>
+        </w:rPr>
+        <w:t xml:space="preserve">Two architecture options, both building on the existing HSTU provider model (nb06):</w:t>
+      </w:r>
+    </w:p>
+    <w:p>
+      <w:pPr>
+        <w:spacing w:after="80"/>
+      </w:pPr>
+    </w:p>
+    <w:p>
+      <w:pPr>
+        <w:spacing w:after="120"/>
+      </w:pPr>
+      <w:r>
+        <w:rPr>
+          <w:rFonts w:ascii="Arial" w:cs="Arial" w:eastAsia="Arial" w:hAnsi="Arial"/>
+          <w:b/>
+          <w:bCs/>
+          <w:sz w:val="22"/>
+          <w:szCs w:val="22"/>
+        </w:rPr>
+        <w:t xml:space="preserve">Option A — REINFORCE on top of HSTU (simpler): </w:t>
+      </w:r>
+      <w:r>
+        <w:rPr>
+          <w:rFonts w:ascii="Arial" w:cs="Arial" w:eastAsia="Arial" w:hAnsi="Arial"/>
+          <w:sz w:val="22"/>
+          <w:szCs w:val="22"/>
+        </w:rPr>
+        <w:t xml:space="preserve">Freeze the pretrained HSTU encoder. Add a policy head that takes the user representation (160-dim) and outputs a distribution over the provider vocab. Train with REINFORCE: log_prob(predicted_provider) * reward. Baseline subtraction via running average reward to reduce variance.</w:t>
+      </w:r>
+    </w:p>
+    <w:p>
+      <w:pPr>
+        <w:spacing w:after="80"/>
+      </w:pPr>
+    </w:p>
+    <w:p>
+      <w:pPr>
+        <w:spacing w:after="120"/>
+      </w:pPr>
+      <w:r>
+        <w:rPr>
+          <w:rFonts w:ascii="Arial" w:cs="Arial" w:eastAsia="Arial" w:hAnsi="Arial"/>
+          <w:b/>
+          <w:bCs/>
+          <w:sz w:val="22"/>
+          <w:szCs w:val="22"/>
+        </w:rPr>
+        <w:t xml:space="preserve">Option B — Reward-weighted InfoNCE (recommended): </w:t>
+      </w:r>
+      <w:r>
+        <w:rPr>
+          <w:rFonts w:ascii="Arial" w:cs="Arial" w:eastAsia="Arial" w:hAnsi="Arial"/>
+          <w:sz w:val="22"/>
+          <w:szCs w:val="22"/>
+        </w:rPr>
+        <w:t xml:space="preserve">Modify the existing InfoNCE loss to weight positive examples by their reward score instead of treating all positives equally. High-reward providers (quality + in-network) get higher weight in the contrastive loss. Low-reward providers (visited but poor quality) get reduced weight. No architecture change — only loss function change. The model still learns from the same data but with a clinical quality bias.</w:t>
+      </w:r>
+    </w:p>
+    <w:p>
+      <w:pPr>
+        <w:spacing w:after="80"/>
+      </w:pPr>
+    </w:p>
+    <w:p>
+      <w:pPr>
+        <w:spacing w:after="120"/>
+      </w:pPr>
+      <w:r>
+        <w:rPr>
+          <w:rFonts w:ascii="Arial" w:cs="Arial" w:eastAsia="Arial" w:hAnsi="Arial"/>
+          <w:sz w:val="22"/>
+          <w:szCs w:val="22"/>
+        </w:rPr>
+        <w:t xml:space="preserve">Option B is recommended because it requires minimal code change (modify the InfoNCE loss in nb06), preserves the pretrained embeddings, and avoids the high variance of policy gradient methods.</w:t>
+      </w:r>
+    </w:p>
+    <w:p>
+      <w:pPr>
+        <w:spacing w:after="80"/>
+      </w:pPr>
+    </w:p>
+    <w:p>
+      <w:pPr>
+        <w:spacing w:after="120"/>
+      </w:pPr>
+      <w:r>
+        <w:rPr>
+          <w:rFonts w:ascii="Arial" w:cs="Arial" w:eastAsia="Arial" w:hAnsi="Arial"/>
+          <w:b/>
+          <w:bCs/>
+          <w:sz w:val="22"/>
+          <w:szCs w:val="22"/>
+        </w:rPr>
+        <w:t xml:space="preserve">Implementation (Option B):</w:t>
+      </w:r>
+    </w:p>
+    <w:p>
+      <w:pPr>
+        <w:spacing w:after="80"/>
+        <w:ind w:left="360"/>
+      </w:pPr>
+      <w:r>
+        <w:rPr>
+          <w:rFonts w:ascii="Consolas" w:cs="Consolas" w:eastAsia="Consolas" w:hAnsi="Consolas"/>
+          <w:color w:val="333333"/>
+          <w:sz w:val="20"/>
+          <w:szCs w:val="20"/>
+        </w:rPr>
+        <w:t xml:space="preserve"># Current InfoNCE: all positives weighted equally</w:t>
+      </w:r>
+    </w:p>
+    <w:p>
+      <w:pPr>
+        <w:spacing w:after="80"/>
+        <w:ind w:left="360"/>
+      </w:pPr>
+      <w:r>
+        <w:rPr>
+          <w:rFonts w:ascii="Consolas" w:cs="Consolas" w:eastAsia="Consolas" w:hAnsi="Consolas"/>
+          <w:color w:val="333333"/>
+          <w:sz w:val="20"/>
+          <w:szCs w:val="20"/>
+        </w:rPr>
+        <w:t xml:space="preserve">loss = -log(exp(pos_score) / (exp(pos_score) + sum(exp(neg_scores))))</w:t>
+      </w:r>
+    </w:p>
+    <w:p>
+      <w:pPr>
+        <w:spacing w:after="80"/>
+        <w:ind w:left="360"/>
+      </w:pPr>
+      <w:r>
+        <w:rPr>
+          <w:rFonts w:ascii="Consolas" w:cs="Consolas" w:eastAsia="Consolas" w:hAnsi="Consolas"/>
+          <w:color w:val="333333"/>
+          <w:sz w:val="20"/>
+          <w:szCs w:val="20"/>
+        </w:rPr>
+        <w:t xml:space="preserve"/>
+      </w:r>
+    </w:p>
+    <w:p>
+      <w:pPr>
+        <w:spacing w:after="80"/>
+        <w:ind w:left="360"/>
+      </w:pPr>
+      <w:r>
+        <w:rPr>
+          <w:rFonts w:ascii="Consolas" w:cs="Consolas" w:eastAsia="Consolas" w:hAnsi="Consolas"/>
+          <w:color w:val="333333"/>
+          <w:sz w:val="20"/>
+          <w:szCs w:val="20"/>
+        </w:rPr>
+        <w:t xml:space="preserve"># Reward-weighted InfoNCE: scale positive contribution by reward</w:t>
+      </w:r>
+    </w:p>
+    <w:p>
+      <w:pPr>
+        <w:spacing w:after="80"/>
+        <w:ind w:left="360"/>
+      </w:pPr>
+      <w:r>
+        <w:rPr>
+          <w:rFonts w:ascii="Consolas" w:cs="Consolas" w:eastAsia="Consolas" w:hAnsi="Consolas"/>
+          <w:color w:val="333333"/>
+          <w:sz w:val="20"/>
+          <w:szCs w:val="20"/>
+        </w:rPr>
+        <w:t xml:space="preserve">loss = -reward_weight * log(exp(pos_score) / (exp(pos_score) + sum(exp(neg_scores))))</w:t>
+      </w:r>
+    </w:p>
+    <w:p>
+      <w:pPr>
+        <w:spacing w:after="80"/>
+        <w:ind w:left="360"/>
+      </w:pPr>
+      <w:r>
+        <w:rPr>
+          <w:rFonts w:ascii="Consolas" w:cs="Consolas" w:eastAsia="Consolas" w:hAnsi="Consolas"/>
+          <w:color w:val="333333"/>
+          <w:sz w:val="20"/>
+          <w:szCs w:val="20"/>
+        </w:rPr>
+        <w:t xml:space="preserve"># where reward_weight = softmax(rewards) across positives in the batch</w:t>
+      </w:r>
+    </w:p>
+    <w:p>
+      <w:pPr>
+        <w:spacing w:after="80"/>
+      </w:pPr>
+    </w:p>
+    <w:p>
+      <w:pPr>
+        <w:spacing w:after="120"/>
+      </w:pPr>
+      <w:r>
+        <w:rPr>
+          <w:rFonts w:ascii="Arial" w:cs="Arial" w:eastAsia="Arial" w:hAnsi="Arial"/>
+          <w:b/>
+          <w:bCs/>
+          <w:sz w:val="22"/>
+          <w:szCs w:val="22"/>
+        </w:rPr>
+        <w:t xml:space="preserve">Deliverable: </w:t>
+      </w:r>
+      <w:r>
+        <w:rPr>
+          <w:rFonts w:ascii="Arial" w:cs="Arial" w:eastAsia="Arial" w:hAnsi="Arial"/>
+          <w:sz w:val="22"/>
+          <w:szCs w:val="22"/>
+        </w:rPr>
+        <w:t xml:space="preserve">Modified nb06 with reward-weighted loss. New training script nb06b_Model_HSTU_RL.py.</w:t>
+      </w:r>
+    </w:p>
+    <w:p>
+      <w:pPr>
+        <w:spacing w:after="80"/>
+      </w:pPr>
+    </w:p>
+    <w:p>
+      <w:pPr>
+        <w:spacing w:after="120"/>
+      </w:pPr>
+      <w:r>
+        <w:rPr>
+          <w:rFonts w:ascii="Arial" w:cs="Arial" w:eastAsia="Arial" w:hAnsi="Arial"/>
+          <w:b/>
+          <w:bCs/>
+          <w:sz w:val="22"/>
+          <w:szCs w:val="22"/>
+        </w:rPr>
+        <w:t xml:space="preserve">Phase 3.4 — Evaluation Framework (2 weeks)</w:t>
+      </w:r>
+    </w:p>
+    <w:p>
+      <w:pPr>
+        <w:spacing w:after="120"/>
+      </w:pPr>
+      <w:r>
+        <w:rPr>
+          <w:rFonts w:ascii="Arial" w:cs="Arial" w:eastAsia="Arial" w:hAnsi="Arial"/>
+          <w:sz w:val="22"/>
+          <w:szCs w:val="22"/>
+        </w:rPr>
+        <w:t xml:space="preserve">Standard accuracy metrics (Hit@K, NDCG) remain but are supplemented with value metrics:</w:t>
+      </w:r>
+    </w:p>
+    <w:p>
+      <w:pPr>
+        <w:spacing w:after="80"/>
+      </w:pPr>
+    </w:p>
+    <w:tbl>
+      <w:tblPr>
+        <w:tblW w:type="dxa" w:w="9360"/>
+        <w:tblBorders>
+          <w:top w:val="single" w:color="auto" w:sz="4"/>
+          <w:left w:val="single" w:color="auto" w:sz="4"/>
+          <w:bottom w:val="single" w:color="auto" w:sz="4"/>
+          <w:right w:val="single" w:color="auto" w:sz="4"/>
+          <w:insideH w:val="single" w:color="auto" w:sz="4"/>
+          <w:insideV w:val="single" w:color="auto" w:sz="4"/>
+        </w:tblBorders>
+      </w:tblPr>
+      <w:tblGrid>
+        <w:gridCol w:w="2500"/>
+        <w:gridCol w:w="4500"/>
+        <w:gridCol w:w="2360"/>
+      </w:tblGrid>
+      <w:tr>
+        <w:trPr>
+          <w:tblHeader/>
+        </w:trPr>
+        <w:tc>
+          <w:tcPr>
+            <w:tcW w:type="dxa" w:w="2500"/>
+            <w:tcBorders>
+              <w:top w:val="single" w:color="CCCCCC" w:sz="1"/>
+              <w:left w:val="single" w:color="CCCCCC" w:sz="1"/>
+              <w:bottom w:val="single" w:color="CCCCCC" w:sz="1"/>
+              <w:right w:val="single" w:color="CCCCCC" w:sz="1"/>
+            </w:tcBorders>
+            <w:shd w:fill="2B579A" w:val="clear"/>
+            <w:tcMar>
+              <w:top w:type="dxa" w:w="60"/>
+              <w:left w:type="dxa" w:w="100"/>
+              <w:bottom w:type="dxa" w:w="60"/>
+              <w:right w:type="dxa" w:w="100"/>
+            </w:tcMar>
+          </w:tcPr>
+          <w:p>
+            <w:r>
+              <w:rPr>
+                <w:rFonts w:ascii="Arial" w:cs="Arial" w:eastAsia="Arial" w:hAnsi="Arial"/>
+                <w:b/>
+                <w:bCs/>
+                <w:color w:val="FFFFFF"/>
+                <w:sz w:val="20"/>
+                <w:szCs w:val="20"/>
+              </w:rPr>
+              <w:t xml:space="preserve">Metric</w:t>
+            </w:r>
+          </w:p>
+        </w:tc>
+        <w:tc>
+          <w:tcPr>
+            <w:tcW w:type="dxa" w:w="4500"/>
+            <w:tcBorders>
+              <w:top w:val="single" w:color="CCCCCC" w:sz="1"/>
+              <w:left w:val="single" w:color="CCCCCC" w:sz="1"/>
+              <w:bottom w:val="single" w:color="CCCCCC" w:sz="1"/>
+              <w:right w:val="single" w:color="CCCCCC" w:sz="1"/>
+            </w:tcBorders>
+            <w:shd w:fill="2B579A" w:val="clear"/>
+            <w:tcMar>
+              <w:top w:type="dxa" w:w="60"/>
+              <w:left w:type="dxa" w:w="100"/>
+              <w:bottom w:type="dxa" w:w="60"/>
+              <w:right w:type="dxa" w:w="100"/>
+            </w:tcMar>
+          </w:tcPr>
+          <w:p>
+            <w:r>
+              <w:rPr>
+                <w:rFonts w:ascii="Arial" w:cs="Arial" w:eastAsia="Arial" w:hAnsi="Arial"/>
+                <w:b/>
+                <w:bCs/>
+                <w:color w:val="FFFFFF"/>
+                <w:sz w:val="20"/>
+                <w:szCs w:val="20"/>
+              </w:rPr>
+              <w:t xml:space="preserve">Definition</w:t>
+            </w:r>
+          </w:p>
+        </w:tc>
+        <w:tc>
+          <w:tcPr>
+            <w:tcW w:type="dxa" w:w="2360"/>
+            <w:tcBorders>
+              <w:top w:val="single" w:color="CCCCCC" w:sz="1"/>
+              <w:left w:val="single" w:color="CCCCCC" w:sz="1"/>
+              <w:bottom w:val="single" w:color="CCCCCC" w:sz="1"/>
+              <w:right w:val="single" w:color="CCCCCC" w:sz="1"/>
+            </w:tcBorders>
+            <w:shd w:fill="2B579A" w:val="clear"/>
+            <w:tcMar>
+              <w:top w:type="dxa" w:w="60"/>
+              <w:left w:type="dxa" w:w="100"/>
+              <w:bottom w:type="dxa" w:w="60"/>
+              <w:right w:type="dxa" w:w="100"/>
+            </w:tcMar>
+          </w:tcPr>
+          <w:p>
+            <w:r>
+              <w:rPr>
+                <w:rFonts w:ascii="Arial" w:cs="Arial" w:eastAsia="Arial" w:hAnsi="Arial"/>
+                <w:b/>
+                <w:bCs/>
+                <w:color w:val="FFFFFF"/>
+                <w:sz w:val="20"/>
+                <w:szCs w:val="20"/>
+              </w:rPr>
+              <w:t xml:space="preserve">Target</w:t>
             </w:r>
           </w:p>
         </w:tc>
@@ -2365,82 +3115,55 @@
       <w:tr>
         <w:tc>
           <w:tcPr>
-            <w:tcW w:type="dxa" w:w="800"/>
-            <w:tcBorders>
-              <w:top w:val="single" w:color="CCCCCC" w:sz="1"/>
-              <w:left w:val="single" w:color="CCCCCC" w:sz="1"/>
-              <w:bottom w:val="single" w:color="CCCCCC" w:sz="1"/>
-              <w:right w:val="single" w:color="CCCCCC" w:sz="1"/>
-            </w:tcBorders>
-            <w:tcMar>
-              <w:top w:type="dxa" w:w="60"/>
-              <w:left w:type="dxa" w:w="100"/>
-              <w:bottom w:type="dxa" w:w="60"/>
-              <w:right w:type="dxa" w:w="100"/>
-            </w:tcMar>
-          </w:tcPr>
-          <w:p>
-            <w:r>
-              <w:rPr>
-                <w:rFonts w:ascii="Arial" w:cs="Arial" w:eastAsia="Arial" w:hAnsi="Arial"/>
-                <w:sz w:val="20"/>
-                <w:szCs w:val="20"/>
-              </w:rPr>
-              <w:t xml:space="preserve">7</w:t>
-            </w:r>
-          </w:p>
-        </w:tc>
-        <w:tc>
-          <w:tcPr>
-            <w:tcW w:type="dxa" w:w="3000"/>
-            <w:tcBorders>
-              <w:top w:val="single" w:color="CCCCCC" w:sz="1"/>
-              <w:left w:val="single" w:color="CCCCCC" w:sz="1"/>
-              <w:bottom w:val="single" w:color="CCCCCC" w:sz="1"/>
-              <w:right w:val="single" w:color="CCCCCC" w:sz="1"/>
-            </w:tcBorders>
-            <w:tcMar>
-              <w:top w:type="dxa" w:w="60"/>
-              <w:left w:type="dxa" w:w="100"/>
-              <w:bottom w:type="dxa" w:w="60"/>
-              <w:right w:type="dxa" w:w="100"/>
-            </w:tcMar>
-          </w:tcPr>
-          <w:p>
-            <w:r>
-              <w:rPr>
-                <w:rFonts w:ascii="Arial" w:cs="Arial" w:eastAsia="Arial" w:hAnsi="Arial"/>
-                <w:sz w:val="20"/>
-                <w:szCs w:val="20"/>
-              </w:rPr>
-              <w:t xml:space="preserve">Provider quality signal integration</w:t>
-            </w:r>
-          </w:p>
-        </w:tc>
-        <w:tc>
-          <w:tcPr>
-            <w:tcW w:type="dxa" w:w="3200"/>
-            <w:tcBorders>
-              <w:top w:val="single" w:color="CCCCCC" w:sz="1"/>
-              <w:left w:val="single" w:color="CCCCCC" w:sz="1"/>
-              <w:bottom w:val="single" w:color="CCCCCC" w:sz="1"/>
-              <w:right w:val="single" w:color="CCCCCC" w:sz="1"/>
-            </w:tcBorders>
-            <w:tcMar>
-              <w:top w:type="dxa" w:w="60"/>
-              <w:left w:type="dxa" w:w="100"/>
-              <w:bottom w:type="dxa" w:w="60"/>
-              <w:right w:type="dxa" w:w="100"/>
-            </w:tcMar>
-          </w:tcPr>
-          <w:p>
-            <w:r>
-              <w:rPr>
-                <w:rFonts w:ascii="Arial" w:cs="Arial" w:eastAsia="Arial" w:hAnsi="Arial"/>
-                <w:sz w:val="20"/>
-                <w:szCs w:val="20"/>
-              </w:rPr>
-              <w:t xml:space="preserve">Predict routing to high-quality providers, not just likely ones</w:t>
+            <w:tcW w:type="dxa" w:w="2500"/>
+            <w:tcBorders>
+              <w:top w:val="single" w:color="CCCCCC" w:sz="1"/>
+              <w:left w:val="single" w:color="CCCCCC" w:sz="1"/>
+              <w:bottom w:val="single" w:color="CCCCCC" w:sz="1"/>
+              <w:right w:val="single" w:color="CCCCCC" w:sz="1"/>
+            </w:tcBorders>
+            <w:tcMar>
+              <w:top w:type="dxa" w:w="60"/>
+              <w:left w:type="dxa" w:w="100"/>
+              <w:bottom w:type="dxa" w:w="60"/>
+              <w:right w:type="dxa" w:w="100"/>
+            </w:tcMar>
+          </w:tcPr>
+          <w:p>
+            <w:r>
+              <w:rPr>
+                <w:rFonts w:ascii="Arial" w:cs="Arial" w:eastAsia="Arial" w:hAnsi="Arial"/>
+                <w:sz w:val="20"/>
+                <w:szCs w:val="20"/>
+              </w:rPr>
+              <w:t xml:space="preserve">Hit@5 (unchanged)</w:t>
+            </w:r>
+          </w:p>
+        </w:tc>
+        <w:tc>
+          <w:tcPr>
+            <w:tcW w:type="dxa" w:w="4500"/>
+            <w:tcBorders>
+              <w:top w:val="single" w:color="CCCCCC" w:sz="1"/>
+              <w:left w:val="single" w:color="CCCCCC" w:sz="1"/>
+              <w:bottom w:val="single" w:color="CCCCCC" w:sz="1"/>
+              <w:right w:val="single" w:color="CCCCCC" w:sz="1"/>
+            </w:tcBorders>
+            <w:tcMar>
+              <w:top w:type="dxa" w:w="60"/>
+              <w:left w:type="dxa" w:w="100"/>
+              <w:bottom w:type="dxa" w:w="60"/>
+              <w:right w:type="dxa" w:w="100"/>
+            </w:tcMar>
+          </w:tcPr>
+          <w:p>
+            <w:r>
+              <w:rPr>
+                <w:rFonts w:ascii="Arial" w:cs="Arial" w:eastAsia="Arial" w:hAnsi="Arial"/>
+                <w:sz w:val="20"/>
+                <w:szCs w:val="20"/>
+              </w:rPr>
+              <w:t xml:space="preserve">At least one correct provider in top 5</w:t>
             </w:r>
           </w:p>
         </w:tc>
@@ -2467,12 +3190,467 @@
                 <w:sz w:val="20"/>
                 <w:szCs w:val="20"/>
               </w:rPr>
-              <w:t xml:space="preserve">Medium — external data join</w:t>
+              <w:t xml:space="preserve">Maintain current ~46%</w:t>
+            </w:r>
+          </w:p>
+        </w:tc>
+      </w:tr>
+      <w:tr>
+        <w:tc>
+          <w:tcPr>
+            <w:tcW w:type="dxa" w:w="2500"/>
+            <w:tcBorders>
+              <w:top w:val="single" w:color="CCCCCC" w:sz="1"/>
+              <w:left w:val="single" w:color="CCCCCC" w:sz="1"/>
+              <w:bottom w:val="single" w:color="CCCCCC" w:sz="1"/>
+              <w:right w:val="single" w:color="CCCCCC" w:sz="1"/>
+            </w:tcBorders>
+            <w:shd w:fill="F2F2F2" w:val="clear"/>
+            <w:tcMar>
+              <w:top w:type="dxa" w:w="60"/>
+              <w:left w:type="dxa" w:w="100"/>
+              <w:bottom w:type="dxa" w:w="60"/>
+              <w:right w:type="dxa" w:w="100"/>
+            </w:tcMar>
+          </w:tcPr>
+          <w:p>
+            <w:r>
+              <w:rPr>
+                <w:rFonts w:ascii="Arial" w:cs="Arial" w:eastAsia="Arial" w:hAnsi="Arial"/>
+                <w:sz w:val="20"/>
+                <w:szCs w:val="20"/>
+              </w:rPr>
+              <w:t xml:space="preserve">Quality-weighted Hit@5</w:t>
+            </w:r>
+          </w:p>
+        </w:tc>
+        <w:tc>
+          <w:tcPr>
+            <w:tcW w:type="dxa" w:w="4500"/>
+            <w:tcBorders>
+              <w:top w:val="single" w:color="CCCCCC" w:sz="1"/>
+              <w:left w:val="single" w:color="CCCCCC" w:sz="1"/>
+              <w:bottom w:val="single" w:color="CCCCCC" w:sz="1"/>
+              <w:right w:val="single" w:color="CCCCCC" w:sz="1"/>
+            </w:tcBorders>
+            <w:shd w:fill="F2F2F2" w:val="clear"/>
+            <w:tcMar>
+              <w:top w:type="dxa" w:w="60"/>
+              <w:left w:type="dxa" w:w="100"/>
+              <w:bottom w:type="dxa" w:w="60"/>
+              <w:right w:type="dxa" w:w="100"/>
+            </w:tcMar>
+          </w:tcPr>
+          <w:p>
+            <w:r>
+              <w:rPr>
+                <w:rFonts w:ascii="Arial" w:cs="Arial" w:eastAsia="Arial" w:hAnsi="Arial"/>
+                <w:sz w:val="20"/>
+                <w:szCs w:val="20"/>
+              </w:rPr>
+              <w:t xml:space="preserve">Hit@5 but only counting hits on high-quality providers</w:t>
+            </w:r>
+          </w:p>
+        </w:tc>
+        <w:tc>
+          <w:tcPr>
+            <w:tcW w:type="dxa" w:w="2360"/>
+            <w:tcBorders>
+              <w:top w:val="single" w:color="CCCCCC" w:sz="1"/>
+              <w:left w:val="single" w:color="CCCCCC" w:sz="1"/>
+              <w:bottom w:val="single" w:color="CCCCCC" w:sz="1"/>
+              <w:right w:val="single" w:color="CCCCCC" w:sz="1"/>
+            </w:tcBorders>
+            <w:shd w:fill="F2F2F2" w:val="clear"/>
+            <w:tcMar>
+              <w:top w:type="dxa" w:w="60"/>
+              <w:left w:type="dxa" w:w="100"/>
+              <w:bottom w:type="dxa" w:w="60"/>
+              <w:right w:type="dxa" w:w="100"/>
+            </w:tcMar>
+          </w:tcPr>
+          <w:p>
+            <w:r>
+              <w:rPr>
+                <w:rFonts w:ascii="Arial" w:cs="Arial" w:eastAsia="Arial" w:hAnsi="Arial"/>
+                <w:sz w:val="20"/>
+                <w:szCs w:val="20"/>
+              </w:rPr>
+              <w:t xml:space="preserve">Track improvement over baseline</w:t>
+            </w:r>
+          </w:p>
+        </w:tc>
+      </w:tr>
+      <w:tr>
+        <w:tc>
+          <w:tcPr>
+            <w:tcW w:type="dxa" w:w="2500"/>
+            <w:tcBorders>
+              <w:top w:val="single" w:color="CCCCCC" w:sz="1"/>
+              <w:left w:val="single" w:color="CCCCCC" w:sz="1"/>
+              <w:bottom w:val="single" w:color="CCCCCC" w:sz="1"/>
+              <w:right w:val="single" w:color="CCCCCC" w:sz="1"/>
+            </w:tcBorders>
+            <w:tcMar>
+              <w:top w:type="dxa" w:w="60"/>
+              <w:left w:type="dxa" w:w="100"/>
+              <w:bottom w:type="dxa" w:w="60"/>
+              <w:right w:type="dxa" w:w="100"/>
+            </w:tcMar>
+          </w:tcPr>
+          <w:p>
+            <w:r>
+              <w:rPr>
+                <w:rFonts w:ascii="Arial" w:cs="Arial" w:eastAsia="Arial" w:hAnsi="Arial"/>
+                <w:sz w:val="20"/>
+                <w:szCs w:val="20"/>
+              </w:rPr>
+              <w:t xml:space="preserve">Avg reward of top-5</w:t>
+            </w:r>
+          </w:p>
+        </w:tc>
+        <w:tc>
+          <w:tcPr>
+            <w:tcW w:type="dxa" w:w="4500"/>
+            <w:tcBorders>
+              <w:top w:val="single" w:color="CCCCCC" w:sz="1"/>
+              <w:left w:val="single" w:color="CCCCCC" w:sz="1"/>
+              <w:bottom w:val="single" w:color="CCCCCC" w:sz="1"/>
+              <w:right w:val="single" w:color="CCCCCC" w:sz="1"/>
+            </w:tcBorders>
+            <w:tcMar>
+              <w:top w:type="dxa" w:w="60"/>
+              <w:left w:type="dxa" w:w="100"/>
+              <w:bottom w:type="dxa" w:w="60"/>
+              <w:right w:type="dxa" w:w="100"/>
+            </w:tcMar>
+          </w:tcPr>
+          <w:p>
+            <w:r>
+              <w:rPr>
+                <w:rFonts w:ascii="Arial" w:cs="Arial" w:eastAsia="Arial" w:hAnsi="Arial"/>
+                <w:sz w:val="20"/>
+                <w:szCs w:val="20"/>
+              </w:rPr>
+              <w:t xml:space="preserve">Mean composite reward across top-5 predictions</w:t>
+            </w:r>
+          </w:p>
+        </w:tc>
+        <w:tc>
+          <w:tcPr>
+            <w:tcW w:type="dxa" w:w="2360"/>
+            <w:tcBorders>
+              <w:top w:val="single" w:color="CCCCCC" w:sz="1"/>
+              <w:left w:val="single" w:color="CCCCCC" w:sz="1"/>
+              <w:bottom w:val="single" w:color="CCCCCC" w:sz="1"/>
+              <w:right w:val="single" w:color="CCCCCC" w:sz="1"/>
+            </w:tcBorders>
+            <w:tcMar>
+              <w:top w:type="dxa" w:w="60"/>
+              <w:left w:type="dxa" w:w="100"/>
+              <w:bottom w:type="dxa" w:w="60"/>
+              <w:right w:type="dxa" w:w="100"/>
+            </w:tcMar>
+          </w:tcPr>
+          <w:p>
+            <w:r>
+              <w:rPr>
+                <w:rFonts w:ascii="Arial" w:cs="Arial" w:eastAsia="Arial" w:hAnsi="Arial"/>
+                <w:sz w:val="20"/>
+                <w:szCs w:val="20"/>
+              </w:rPr>
+              <w:t xml:space="preserve">Higher than HSTU without RL</w:t>
+            </w:r>
+          </w:p>
+        </w:tc>
+      </w:tr>
+      <w:tr>
+        <w:tc>
+          <w:tcPr>
+            <w:tcW w:type="dxa" w:w="2500"/>
+            <w:tcBorders>
+              <w:top w:val="single" w:color="CCCCCC" w:sz="1"/>
+              <w:left w:val="single" w:color="CCCCCC" w:sz="1"/>
+              <w:bottom w:val="single" w:color="CCCCCC" w:sz="1"/>
+              <w:right w:val="single" w:color="CCCCCC" w:sz="1"/>
+            </w:tcBorders>
+            <w:shd w:fill="F2F2F2" w:val="clear"/>
+            <w:tcMar>
+              <w:top w:type="dxa" w:w="60"/>
+              <w:left w:type="dxa" w:w="100"/>
+              <w:bottom w:type="dxa" w:w="60"/>
+              <w:right w:type="dxa" w:w="100"/>
+            </w:tcMar>
+          </w:tcPr>
+          <w:p>
+            <w:r>
+              <w:rPr>
+                <w:rFonts w:ascii="Arial" w:cs="Arial" w:eastAsia="Arial" w:hAnsi="Arial"/>
+                <w:sz w:val="20"/>
+                <w:szCs w:val="20"/>
+              </w:rPr>
+              <w:t xml:space="preserve">In-network rate</w:t>
+            </w:r>
+          </w:p>
+        </w:tc>
+        <w:tc>
+          <w:tcPr>
+            <w:tcW w:type="dxa" w:w="4500"/>
+            <w:tcBorders>
+              <w:top w:val="single" w:color="CCCCCC" w:sz="1"/>
+              <w:left w:val="single" w:color="CCCCCC" w:sz="1"/>
+              <w:bottom w:val="single" w:color="CCCCCC" w:sz="1"/>
+              <w:right w:val="single" w:color="CCCCCC" w:sz="1"/>
+            </w:tcBorders>
+            <w:shd w:fill="F2F2F2" w:val="clear"/>
+            <w:tcMar>
+              <w:top w:type="dxa" w:w="60"/>
+              <w:left w:type="dxa" w:w="100"/>
+              <w:bottom w:type="dxa" w:w="60"/>
+              <w:right w:type="dxa" w:w="100"/>
+            </w:tcMar>
+          </w:tcPr>
+          <w:p>
+            <w:r>
+              <w:rPr>
+                <w:rFonts w:ascii="Arial" w:cs="Arial" w:eastAsia="Arial" w:hAnsi="Arial"/>
+                <w:sz w:val="20"/>
+                <w:szCs w:val="20"/>
+              </w:rPr>
+              <w:t xml:space="preserve">% of top-5 predictions that are in-network</w:t>
+            </w:r>
+          </w:p>
+        </w:tc>
+        <w:tc>
+          <w:tcPr>
+            <w:tcW w:type="dxa" w:w="2360"/>
+            <w:tcBorders>
+              <w:top w:val="single" w:color="CCCCCC" w:sz="1"/>
+              <w:left w:val="single" w:color="CCCCCC" w:sz="1"/>
+              <w:bottom w:val="single" w:color="CCCCCC" w:sz="1"/>
+              <w:right w:val="single" w:color="CCCCCC" w:sz="1"/>
+            </w:tcBorders>
+            <w:shd w:fill="F2F2F2" w:val="clear"/>
+            <w:tcMar>
+              <w:top w:type="dxa" w:w="60"/>
+              <w:left w:type="dxa" w:w="100"/>
+              <w:bottom w:type="dxa" w:w="60"/>
+              <w:right w:type="dxa" w:w="100"/>
+            </w:tcMar>
+          </w:tcPr>
+          <w:p>
+            <w:r>
+              <w:rPr>
+                <w:rFonts w:ascii="Arial" w:cs="Arial" w:eastAsia="Arial" w:hAnsi="Arial"/>
+                <w:sz w:val="20"/>
+                <w:szCs w:val="20"/>
+              </w:rPr>
+              <w:t xml:space="preserve">&gt; 80%</w:t>
+            </w:r>
+          </w:p>
+        </w:tc>
+      </w:tr>
+      <w:tr>
+        <w:tc>
+          <w:tcPr>
+            <w:tcW w:type="dxa" w:w="2500"/>
+            <w:tcBorders>
+              <w:top w:val="single" w:color="CCCCCC" w:sz="1"/>
+              <w:left w:val="single" w:color="CCCCCC" w:sz="1"/>
+              <w:bottom w:val="single" w:color="CCCCCC" w:sz="1"/>
+              <w:right w:val="single" w:color="CCCCCC" w:sz="1"/>
+            </w:tcBorders>
+            <w:tcMar>
+              <w:top w:type="dxa" w:w="60"/>
+              <w:left w:type="dxa" w:w="100"/>
+              <w:bottom w:type="dxa" w:w="60"/>
+              <w:right w:type="dxa" w:w="100"/>
+            </w:tcMar>
+          </w:tcPr>
+          <w:p>
+            <w:r>
+              <w:rPr>
+                <w:rFonts w:ascii="Arial" w:cs="Arial" w:eastAsia="Arial" w:hAnsi="Arial"/>
+                <w:sz w:val="20"/>
+                <w:szCs w:val="20"/>
+              </w:rPr>
+              <w:t xml:space="preserve">Cost efficiency delta</w:t>
+            </w:r>
+          </w:p>
+        </w:tc>
+        <w:tc>
+          <w:tcPr>
+            <w:tcW w:type="dxa" w:w="4500"/>
+            <w:tcBorders>
+              <w:top w:val="single" w:color="CCCCCC" w:sz="1"/>
+              <w:left w:val="single" w:color="CCCCCC" w:sz="1"/>
+              <w:bottom w:val="single" w:color="CCCCCC" w:sz="1"/>
+              <w:right w:val="single" w:color="CCCCCC" w:sz="1"/>
+            </w:tcBorders>
+            <w:tcMar>
+              <w:top w:type="dxa" w:w="60"/>
+              <w:left w:type="dxa" w:w="100"/>
+              <w:bottom w:type="dxa" w:w="60"/>
+              <w:right w:type="dxa" w:w="100"/>
+            </w:tcMar>
+          </w:tcPr>
+          <w:p>
+            <w:r>
+              <w:rPr>
+                <w:rFonts w:ascii="Arial" w:cs="Arial" w:eastAsia="Arial" w:hAnsi="Arial"/>
+                <w:sz w:val="20"/>
+                <w:szCs w:val="20"/>
+              </w:rPr>
+              <w:t xml:space="preserve">Avg allowed_amt of predicted providers vs actual</w:t>
+            </w:r>
+          </w:p>
+        </w:tc>
+        <w:tc>
+          <w:tcPr>
+            <w:tcW w:type="dxa" w:w="2360"/>
+            <w:tcBorders>
+              <w:top w:val="single" w:color="CCCCCC" w:sz="1"/>
+              <w:left w:val="single" w:color="CCCCCC" w:sz="1"/>
+              <w:bottom w:val="single" w:color="CCCCCC" w:sz="1"/>
+              <w:right w:val="single" w:color="CCCCCC" w:sz="1"/>
+            </w:tcBorders>
+            <w:tcMar>
+              <w:top w:type="dxa" w:w="60"/>
+              <w:left w:type="dxa" w:w="100"/>
+              <w:bottom w:type="dxa" w:w="60"/>
+              <w:right w:type="dxa" w:w="100"/>
+            </w:tcMar>
+          </w:tcPr>
+          <w:p>
+            <w:r>
+              <w:rPr>
+                <w:rFonts w:ascii="Arial" w:cs="Arial" w:eastAsia="Arial" w:hAnsi="Arial"/>
+                <w:sz w:val="20"/>
+                <w:szCs w:val="20"/>
+              </w:rPr>
+              <w:t xml:space="preserve">Lower = better routing</w:t>
             </w:r>
           </w:p>
         </w:tc>
       </w:tr>
     </w:tbl>
+    <w:p>
+      <w:pPr>
+        <w:spacing w:after="80"/>
+      </w:pPr>
+    </w:p>
+    <w:p>
+      <w:pPr>
+        <w:spacing w:after="120"/>
+      </w:pPr>
+      <w:r>
+        <w:rPr>
+          <w:rFonts w:ascii="Arial" w:cs="Arial" w:eastAsia="Arial" w:hAnsi="Arial"/>
+          <w:sz w:val="22"/>
+          <w:szCs w:val="22"/>
+        </w:rPr>
+        <w:t xml:space="preserve">Clinical validation: network team reviews top 50 predictions where RL model disagrees with the base HSTU model. The RL model should route to better providers, not just different ones.</w:t>
+      </w:r>
+    </w:p>
+    <w:p>
+      <w:pPr>
+        <w:spacing w:after="80"/>
+      </w:pPr>
+    </w:p>
+    <w:p>
+      <w:pPr>
+        <w:spacing w:after="120"/>
+      </w:pPr>
+      <w:r>
+        <w:rPr>
+          <w:rFonts w:ascii="Arial" w:cs="Arial" w:eastAsia="Arial" w:hAnsi="Arial"/>
+          <w:b/>
+          <w:bCs/>
+          <w:sz w:val="22"/>
+          <w:szCs w:val="22"/>
+        </w:rPr>
+        <w:t xml:space="preserve">Deliverable: </w:t>
+      </w:r>
+      <w:r>
+        <w:rPr>
+          <w:rFonts w:ascii="Arial" w:cs="Arial" w:eastAsia="Arial" w:hAnsi="Arial"/>
+          <w:sz w:val="22"/>
+          <w:szCs w:val="22"/>
+        </w:rPr>
+        <w:t xml:space="preserve">Evaluation SQL + comparison notebook. Clinical review sign-off.</w:t>
+      </w:r>
+    </w:p>
+    <w:p>
+      <w:pPr>
+        <w:spacing w:after="80"/>
+      </w:pPr>
+    </w:p>
+    <w:p>
+      <w:pPr>
+        <w:spacing w:after="120"/>
+      </w:pPr>
+      <w:r>
+        <w:rPr>
+          <w:rFonts w:ascii="Arial" w:cs="Arial" w:eastAsia="Arial" w:hAnsi="Arial"/>
+          <w:b/>
+          <w:bCs/>
+          <w:sz w:val="22"/>
+          <w:szCs w:val="22"/>
+        </w:rPr>
+        <w:t xml:space="preserve">Phase 3.5 — A/B Comparison and Deployment (2-3 weeks)</w:t>
+      </w:r>
+    </w:p>
+    <w:p>
+      <w:pPr>
+        <w:spacing w:after="120"/>
+      </w:pPr>
+      <w:r>
+        <w:rPr>
+          <w:rFonts w:ascii="Arial" w:cs="Arial" w:eastAsia="Arial" w:hAnsi="Arial"/>
+          <w:sz w:val="22"/>
+          <w:szCs w:val="22"/>
+        </w:rPr>
+        <w:t xml:space="preserve">Side-by-side comparison of HSTU (predictive) vs HSTU+RL (prescriptive) on the same test set. Key questions: (1) Does accuracy drop significantly? If Hit@5 drops more than 5 points, the reward weighting is too aggressive. (2) Does quality improve? If avg reward of top-5 does not increase, the reward signal is not informative. (3) Are the recommendations clinically defensible? SME spot-check required.</w:t>
+      </w:r>
+    </w:p>
+    <w:p>
+      <w:pPr>
+        <w:spacing w:after="80"/>
+      </w:pPr>
+    </w:p>
+    <w:p>
+      <w:pPr>
+        <w:spacing w:after="120"/>
+      </w:pPr>
+      <w:r>
+        <w:rPr>
+          <w:rFonts w:ascii="Arial" w:cs="Arial" w:eastAsia="Arial" w:hAnsi="Arial"/>
+          <w:sz w:val="22"/>
+          <w:szCs w:val="22"/>
+        </w:rPr>
+        <w:t xml:space="preserve">If validated, the RL model replaces the base HSTU in the scoring pipeline (nb07). No infrastructure change — same checkpoint format, same BQ output schema.</w:t>
+      </w:r>
+    </w:p>
+    <w:p>
+      <w:pPr>
+        <w:spacing w:after="80"/>
+      </w:pPr>
+    </w:p>
+    <w:p>
+      <w:pPr>
+        <w:spacing w:after="120"/>
+      </w:pPr>
+      <w:r>
+        <w:rPr>
+          <w:rFonts w:ascii="Arial" w:cs="Arial" w:eastAsia="Arial" w:hAnsi="Arial"/>
+          <w:b/>
+          <w:bCs/>
+          <w:sz w:val="22"/>
+          <w:szCs w:val="22"/>
+        </w:rPr>
+        <w:t xml:space="preserve">Total estimated timeline: 11-14 weeks.</w:t>
+      </w:r>
+    </w:p>
     <w:p>
       <w:r>
         <w:br w:type="page"/>

</xml_diff>

<commit_message>
Lineage table: expanded all short forms to full file names, PMA expanded to post model analysis
</commit_message>
<xml_diff>
--- a/docs/model_manual_v2.docx
+++ b/docs/model_manual_v2.docx
@@ -3958,7 +3958,7 @@
                 <w:sz w:val="20"/>
                 <w:szCs w:val="20"/>
               </w:rPr>
-              <w:t xml:space="preserve">_01, _02, PMA_00</w:t>
+              <w:t xml:space="preserve">_01_data_setup_members.sql, _02_data_setup_visits.sql, SQL_PMA_00_lookup.sql</w:t>
             </w:r>
           </w:p>
         </w:tc>
@@ -4044,7 +4044,7 @@
                 <w:sz w:val="20"/>
                 <w:szCs w:val="20"/>
               </w:rPr>
-              <w:t xml:space="preserve">_01</w:t>
+              <w:t xml:space="preserve">_01_data_setup_members.sql</w:t>
             </w:r>
           </w:p>
         </w:tc>
@@ -4072,7 +4072,7 @@
                 <w:sz w:val="20"/>
                 <w:szCs w:val="20"/>
               </w:rPr>
-              <w:t xml:space="preserve">_03</w:t>
+              <w:t xml:space="preserve">_03_data_setup_qualified_visits.sql</w:t>
             </w:r>
           </w:p>
         </w:tc>
@@ -4155,7 +4155,7 @@
                 <w:sz w:val="20"/>
                 <w:szCs w:val="20"/>
               </w:rPr>
-              <w:t xml:space="preserve">_02</w:t>
+              <w:t xml:space="preserve">_02_data_setup_visits.sql</w:t>
             </w:r>
           </w:p>
         </w:tc>
@@ -4182,7 +4182,7 @@
                 <w:sz w:val="20"/>
                 <w:szCs w:val="20"/>
               </w:rPr>
-              <w:t xml:space="preserve">_03, _04, sampling, sequences, sql02, sql03, 03_cutoff</w:t>
+              <w:t xml:space="preserve">_03_data_setup_qualified_visits.sql, _04_visit_sequences.sql, Model_sampling.sql, model_input_sequence_data.sql, sql02_provider_train_test.sql, sql03_provider_sequence_input.sql, 03_provider_transitions_and_cutoff.sql</w:t>
             </w:r>
           </w:p>
         </w:tc>
@@ -4268,7 +4268,7 @@
                 <w:sz w:val="20"/>
                 <w:szCs w:val="20"/>
               </w:rPr>
-              <w:t xml:space="preserve">_03</w:t>
+              <w:t xml:space="preserve">_03_data_setup_qualified_visits.sql</w:t>
             </w:r>
           </w:p>
         </w:tc>
@@ -4296,7 +4296,7 @@
                 <w:sz w:val="20"/>
                 <w:szCs w:val="20"/>
               </w:rPr>
-              <w:t xml:space="preserve">_04, Model_data_setup_01, sampling, train_test_split, sql02, sql03</w:t>
+              <w:t xml:space="preserve">_04_visit_sequences.sql, Model_data_setup_01.sql, Model_sampling.sql, Model_train_test_split.sql, sql02_provider_train_test.sql, sql03_provider_sequence_input.sql</w:t>
             </w:r>
           </w:p>
         </w:tc>
@@ -4379,7 +4379,7 @@
                 <w:sz w:val="20"/>
                 <w:szCs w:val="20"/>
               </w:rPr>
-              <w:t xml:space="preserve">_04</w:t>
+              <w:t xml:space="preserve">_04_visit_sequences.sql</w:t>
             </w:r>
           </w:p>
         </w:tc>
@@ -4406,7 +4406,7 @@
                 <w:sz w:val="20"/>
                 <w:szCs w:val="20"/>
               </w:rPr>
-              <w:t xml:space="preserve">Model_data_setup_01</w:t>
+              <w:t xml:space="preserve">Model_data_setup_01.sql</w:t>
             </w:r>
           </w:p>
         </w:tc>
@@ -4492,7 +4492,7 @@
                 <w:sz w:val="20"/>
                 <w:szCs w:val="20"/>
               </w:rPr>
-              <w:t xml:space="preserve">Model_data_setup_01</w:t>
+              <w:t xml:space="preserve">Model_data_setup_01.sql</w:t>
             </w:r>
           </w:p>
         </w:tc>
@@ -4520,7 +4520,7 @@
                 <w:sz w:val="20"/>
                 <w:szCs w:val="20"/>
               </w:rPr>
-              <w:t xml:space="preserve">Model_Markov</w:t>
+              <w:t xml:space="preserve">Model_Markov.sql</w:t>
             </w:r>
           </w:p>
         </w:tc>
@@ -4603,7 +4603,7 @@
                 <w:sz w:val="20"/>
                 <w:szCs w:val="20"/>
               </w:rPr>
-              <w:t xml:space="preserve">Model_sampling</w:t>
+              <w:t xml:space="preserve">Model_sampling.sql</w:t>
             </w:r>
           </w:p>
         </w:tc>
@@ -4630,7 +4630,7 @@
                 <w:sz w:val="20"/>
                 <w:szCs w:val="20"/>
               </w:rPr>
-              <w:t xml:space="preserve">train_test_split, sequences, sql02, sql03</w:t>
+              <w:t xml:space="preserve">Model_train_test_split.sql, model_input_sequence_data.sql, sql02_provider_train_test.sql, sql03_provider_sequence_input.sql</w:t>
             </w:r>
           </w:p>
         </w:tc>
@@ -4716,7 +4716,7 @@
                 <w:sz w:val="20"/>
                 <w:szCs w:val="20"/>
               </w:rPr>
-              <w:t xml:space="preserve">Model_train_test_split</w:t>
+              <w:t xml:space="preserve">Model_train_test_split.sql</w:t>
             </w:r>
           </w:p>
         </w:tc>
@@ -4744,7 +4744,7 @@
                 <w:sz w:val="20"/>
                 <w:szCs w:val="20"/>
               </w:rPr>
-              <w:t xml:space="preserve">build_train/test_dataset, Model_Markov</w:t>
+              <w:t xml:space="preserve">Model_build_train_dataset.py, Model_build_test_dataset.py, Model_Markov.sql</w:t>
             </w:r>
           </w:p>
         </w:tc>
@@ -4827,7 +4827,7 @@
                 <w:sz w:val="20"/>
                 <w:szCs w:val="20"/>
               </w:rPr>
-              <w:t xml:space="preserve">model_input_sequence_data</w:t>
+              <w:t xml:space="preserve">model_input_sequence_data.sql</w:t>
             </w:r>
           </w:p>
         </w:tc>
@@ -4854,7 +4854,7 @@
                 <w:sz w:val="20"/>
                 <w:szCs w:val="20"/>
               </w:rPr>
-              <w:t xml:space="preserve">build_train/test_dataset</w:t>
+              <w:t xml:space="preserve">Model_build_train_dataset.py, Model_build_test_dataset.py</w:t>
             </w:r>
           </w:p>
         </w:tc>
@@ -4940,7 +4940,7 @@
                 <w:sz w:val="20"/>
                 <w:szCs w:val="20"/>
               </w:rPr>
-              <w:t xml:space="preserve">build_train/test_dataset.py</w:t>
+              <w:t xml:space="preserve">Model_build_train_dataset.py, Model_build_test_dataset.py</w:t>
             </w:r>
           </w:p>
         </w:tc>
@@ -4968,7 +4968,7 @@
                 <w:sz w:val="20"/>
                 <w:szCs w:val="20"/>
               </w:rPr>
-              <w:t xml:space="preserve">BERT4Rec, SASRec training</w:t>
+              <w:t xml:space="preserve">Model_BERT4Rec.py, Model_SASRec.py</w:t>
             </w:r>
           </w:p>
         </w:tc>
@@ -5051,7 +5051,7 @@
                 <w:sz w:val="20"/>
                 <w:szCs w:val="20"/>
               </w:rPr>
-              <w:t xml:space="preserve">BERT4Rec.py, SASRec.py</w:t>
+              <w:t xml:space="preserve">Model_BERT4Rec.py, Model_SASRec.py</w:t>
             </w:r>
           </w:p>
         </w:tc>
@@ -5078,7 +5078,7 @@
                 <w:sz w:val="20"/>
                 <w:szCs w:val="20"/>
               </w:rPr>
-              <w:t xml:space="preserve">Score scripts</w:t>
+              <w:t xml:space="preserve">Model_SASRec_Score.py, Model_Bert4Rec_score.py</w:t>
             </w:r>
           </w:p>
         </w:tc>
@@ -5192,7 +5192,7 @@
                 <w:sz w:val="20"/>
                 <w:szCs w:val="20"/>
               </w:rPr>
-              <w:t xml:space="preserve">Model_Markov_score</w:t>
+              <w:t xml:space="preserve">Model_Markov_score.sql</w:t>
             </w:r>
           </w:p>
         </w:tc>
@@ -5275,7 +5275,7 @@
                 <w:sz w:val="20"/>
                 <w:szCs w:val="20"/>
               </w:rPr>
-              <w:t xml:space="preserve">Score scripts, Markov_score</w:t>
+              <w:t xml:space="preserve">Model_SASRec_Score.py, Model_Bert4Rec_score.py, Model_Markov_score.sql</w:t>
             </w:r>
           </w:p>
         </w:tc>
@@ -5302,7 +5302,7 @@
                 <w:sz w:val="20"/>
                 <w:szCs w:val="20"/>
               </w:rPr>
-              <w:t xml:space="preserve">Specialty eval</w:t>
+              <w:t xml:space="preserve">Post_model_analysis_data_setup1.sql, Model_metrics_at_5_comp.sql</w:t>
             </w:r>
           </w:p>
         </w:tc>
@@ -5388,7 +5388,7 @@
                 <w:sz w:val="20"/>
                 <w:szCs w:val="20"/>
               </w:rPr>
-              <w:t xml:space="preserve">03_cutoff.sql</w:t>
+              <w:t xml:space="preserve">03_provider_transitions_and_cutoff.sql</w:t>
             </w:r>
           </w:p>
         </w:tc>
@@ -5416,7 +5416,7 @@
                 <w:sz w:val="20"/>
                 <w:szCs w:val="20"/>
               </w:rPr>
-              <w:t xml:space="preserve">sql02, nb01</w:t>
+              <w:t xml:space="preserve">sql02_provider_train_test.sql, nb01_build_provider_vocab.py</w:t>
             </w:r>
           </w:p>
         </w:tc>
@@ -5472,7 +5472,7 @@
                 <w:sz w:val="20"/>
                 <w:szCs w:val="20"/>
               </w:rPr>
-              <w:t xml:space="preserve">provider_primary_specialty, hardneg_lookup</w:t>
+              <w:t xml:space="preserve">provider_primary_specialty, provider_hardneg_lookup</w:t>
             </w:r>
           </w:p>
         </w:tc>
@@ -5499,7 +5499,7 @@
                 <w:sz w:val="20"/>
                 <w:szCs w:val="20"/>
               </w:rPr>
-              <w:t xml:space="preserve">sql01b</w:t>
+              <w:t xml:space="preserve">sql01b_hard_negative</w:t>
             </w:r>
           </w:p>
         </w:tc>
@@ -5526,7 +5526,7 @@
                 <w:sz w:val="20"/>
                 <w:szCs w:val="20"/>
               </w:rPr>
-              <w:t xml:space="preserve">nb02, PMA</w:t>
+              <w:t xml:space="preserve">nb02_build_provider_train_dataset.py, SQL_PMA_03_DX_summary_eval.sql, SQL_PMA_04_PROVIDER-LEVEL SUMMARY</w:t>
             </w:r>
           </w:p>
         </w:tc>
@@ -5612,7 +5612,7 @@
                 <w:sz w:val="20"/>
                 <w:szCs w:val="20"/>
               </w:rPr>
-              <w:t xml:space="preserve">sql02</w:t>
+              <w:t xml:space="preserve">sql02_provider_train_test.sql</w:t>
             </w:r>
           </w:p>
         </w:tc>
@@ -5640,7 +5640,7 @@
                 <w:sz w:val="20"/>
                 <w:szCs w:val="20"/>
               </w:rPr>
-              <w:t xml:space="preserve">nb02, nb03, sql04, sql05</w:t>
+              <w:t xml:space="preserve">nb02_build_provider_train_dataset.py, nb03_build_provider_test_dataset.py, sql04_markov_baseline.sql, sql05_provider_pred_eval.sql</w:t>
             </w:r>
           </w:p>
         </w:tc>
@@ -5723,7 +5723,7 @@
                 <w:sz w:val="20"/>
                 <w:szCs w:val="20"/>
               </w:rPr>
-              <w:t xml:space="preserve">sql03</w:t>
+              <w:t xml:space="preserve">sql03_provider_sequence_input.sql</w:t>
             </w:r>
           </w:p>
         </w:tc>
@@ -5750,7 +5750,7 @@
                 <w:sz w:val="20"/>
                 <w:szCs w:val="20"/>
               </w:rPr>
-              <w:t xml:space="preserve">nb02, nb03</w:t>
+              <w:t xml:space="preserve">nb02_build_provider_train_dataset.py, nb03_build_provider_test_dataset.py</w:t>
             </w:r>
           </w:p>
         </w:tc>
@@ -5836,7 +5836,7 @@
                 <w:sz w:val="20"/>
                 <w:szCs w:val="20"/>
               </w:rPr>
-              <w:t xml:space="preserve">nb01, nb02, nb03</w:t>
+              <w:t xml:space="preserve">nb01_build_provider_vocab.py, nb02_build_provider_train_dataset.py, nb03_build_provider_test_dataset.py</w:t>
             </w:r>
           </w:p>
         </w:tc>
@@ -5864,7 +5864,7 @@
                 <w:sz w:val="20"/>
                 <w:szCs w:val="20"/>
               </w:rPr>
-              <w:t xml:space="preserve">nb04-07</w:t>
+              <w:t xml:space="preserve">nb04_Model_SASRec_provider.py, nb05_Model_BERT4rec_provider.py, nb06_Model_HSTU_provider.py, nb07_scoring_notebook.py</w:t>
             </w:r>
           </w:p>
         </w:tc>
@@ -5947,7 +5947,7 @@
                 <w:sz w:val="20"/>
                 <w:szCs w:val="20"/>
               </w:rPr>
-              <w:t xml:space="preserve">nb04, nb05, nb06</w:t>
+              <w:t xml:space="preserve">nb04_Model_SASRec_provider.py, nb05_Model_BERT4rec_provider.py, nb06_Model_HSTU_provider.py</w:t>
             </w:r>
           </w:p>
         </w:tc>
@@ -5974,7 +5974,7 @@
                 <w:sz w:val="20"/>
                 <w:szCs w:val="20"/>
               </w:rPr>
-              <w:t xml:space="preserve">nb07</w:t>
+              <w:t xml:space="preserve">nb07_scoring_notebook.py</w:t>
             </w:r>
           </w:p>
         </w:tc>
@@ -6060,7 +6060,7 @@
                 <w:sz w:val="20"/>
                 <w:szCs w:val="20"/>
               </w:rPr>
-              <w:t xml:space="preserve">sql04</w:t>
+              <w:t xml:space="preserve">sql04_markov_baseline.sql</w:t>
             </w:r>
           </w:p>
         </w:tc>
@@ -6088,7 +6088,7 @@
                 <w:sz w:val="20"/>
                 <w:szCs w:val="20"/>
               </w:rPr>
-              <w:t xml:space="preserve">sql05</w:t>
+              <w:t xml:space="preserve">sql05_provider_pred_eval.sql</w:t>
             </w:r>
           </w:p>
         </w:tc>
@@ -6171,7 +6171,7 @@
                 <w:sz w:val="20"/>
                 <w:szCs w:val="20"/>
               </w:rPr>
-              <w:t xml:space="preserve">nb07</w:t>
+              <w:t xml:space="preserve">nb07_scoring_notebook.py</w:t>
             </w:r>
           </w:p>
         </w:tc>
@@ -6198,7 +6198,7 @@
                 <w:sz w:val="20"/>
                 <w:szCs w:val="20"/>
               </w:rPr>
-              <w:t xml:space="preserve">sql05</w:t>
+              <w:t xml:space="preserve">sql05_provider_pred_eval.sql</w:t>
             </w:r>
           </w:p>
         </w:tc>
@@ -6256,7 +6256,7 @@
                 <w:sz w:val="20"/>
                 <w:szCs w:val="20"/>
               </w:rPr>
-              <w:t xml:space="preserve">provider_eval, provider_eval_visit</w:t>
+              <w:t xml:space="preserve">provider_eval_5pct, provider_eval_visit_5pct</w:t>
             </w:r>
           </w:p>
         </w:tc>
@@ -6284,7 +6284,7 @@
                 <w:sz w:val="20"/>
                 <w:szCs w:val="20"/>
               </w:rPr>
-              <w:t xml:space="preserve">sql05, sql06</w:t>
+              <w:t xml:space="preserve">sql05_provider_pred_eval.sql, sql06_prov_visit_level.sql</w:t>
             </w:r>
           </w:p>
         </w:tc>
@@ -6312,7 +6312,7 @@
                 <w:sz w:val="20"/>
                 <w:szCs w:val="20"/>
               </w:rPr>
-              <w:t xml:space="preserve">PMA_01-04, rollup</w:t>
+              <w:t xml:space="preserve">SQL_PMA_01_Transition_buckets_model_perf.sql, SQL_PMA_02_DX_level_performance.sql, SQL_PMA_03_DX_summary_eval.sql, SQL_PMA_04_PROVIDER-LEVEL SUMMARY, SQL_PMA_rollup.sql, SQL_PMA_rollup2.sql</w:t>
             </w:r>
           </w:p>
         </w:tc>
@@ -6368,7 +6368,7 @@
                 <w:sz w:val="20"/>
                 <w:szCs w:val="20"/>
               </w:rPr>
-              <w:t xml:space="preserve">specialty perf tables</w:t>
+              <w:t xml:space="preserve">specialty perf tables (overall, by_diag, by_ending_specialty, perf_full)</w:t>
             </w:r>
           </w:p>
         </w:tc>
@@ -6395,7 +6395,7 @@
                 <w:sz w:val="20"/>
                 <w:szCs w:val="20"/>
               </w:rPr>
-              <w:t xml:space="preserve">Post_model_analysis_data_setup1, metrics_at_5_comp</w:t>
+              <w:t xml:space="preserve">Post_model_analysis_data_setup1.sql, Model_metrics_at_5_comp.sql</w:t>
             </w:r>
           </w:p>
         </w:tc>
@@ -6480,7 +6480,7 @@
                 <w:sz w:val="20"/>
                 <w:szCs w:val="20"/>
               </w:rPr>
-              <w:t xml:space="preserve">PMA tables, monthly rollups</w:t>
+              <w:t xml:space="preserve">post model analysis tables, monthly rollups</w:t>
             </w:r>
           </w:p>
         </w:tc>
@@ -6508,7 +6508,7 @@
                 <w:sz w:val="20"/>
                 <w:szCs w:val="20"/>
               </w:rPr>
-              <w:t xml:space="preserve">PMA_00-04, rollup/2</w:t>
+              <w:t xml:space="preserve">SQL_PMA_00_lookup.sql, SQL_PMA_01_Transition_buckets_model_perf.sql, SQL_PMA_02_DX_level_performance.sql, SQL_PMA_03_DX_summary_eval.sql, SQL_PMA_04_PROVIDER-LEVEL SUMMARY, SQL_PMA_rollup.sql, SQL_PMA_rollup2.sql</w:t>
             </w:r>
           </w:p>
         </w:tc>

</xml_diff>

<commit_message>
Glossary table: expanded all Source column short forms to full file names
</commit_message>
<xml_diff>
--- a/docs/model_manual_v2.docx
+++ b/docs/model_manual_v2.docx
@@ -14417,7 +14417,7 @@
                 <w:sz w:val="20"/>
                 <w:szCs w:val="20"/>
               </w:rPr>
-              <w:t xml:space="preserve">SQL_PMA_rollup</w:t>
+              <w:t xml:space="preserve">SQL_PMA_rollup.sql</w:t>
             </w:r>
           </w:p>
         </w:tc>
@@ -14531,7 +14531,7 @@
                 <w:sz w:val="20"/>
                 <w:szCs w:val="20"/>
               </w:rPr>
-              <w:t xml:space="preserve">EDA_penetration</w:t>
+              <w:t xml:space="preserve">EDA_penetration_file.sql</w:t>
             </w:r>
           </w:p>
         </w:tc>
@@ -14641,7 +14641,7 @@
                 <w:sz w:val="20"/>
                 <w:szCs w:val="20"/>
               </w:rPr>
-              <w:t xml:space="preserve">_03</w:t>
+              <w:t xml:space="preserve">_03_data_setup_qualified_visits.sql</w:t>
             </w:r>
           </w:p>
         </w:tc>
@@ -14755,7 +14755,7 @@
                 <w:sz w:val="20"/>
                 <w:szCs w:val="20"/>
               </w:rPr>
-              <w:t xml:space="preserve">_04</w:t>
+              <w:t xml:space="preserve">_04_visit_sequences.sql</w:t>
             </w:r>
           </w:p>
         </w:tc>
@@ -14865,7 +14865,7 @@
                 <w:sz w:val="20"/>
                 <w:szCs w:val="20"/>
               </w:rPr>
-              <w:t xml:space="preserve">_02</w:t>
+              <w:t xml:space="preserve">_02_data_setup_visits.sql</w:t>
             </w:r>
           </w:p>
         </w:tc>
@@ -14979,7 +14979,7 @@
                 <w:sz w:val="20"/>
                 <w:szCs w:val="20"/>
               </w:rPr>
-              <w:t xml:space="preserve">_01</w:t>
+              <w:t xml:space="preserve">_01_data_setup_members.sql</w:t>
             </w:r>
           </w:p>
         </w:tc>
@@ -15089,7 +15089,7 @@
                 <w:sz w:val="20"/>
                 <w:szCs w:val="20"/>
               </w:rPr>
-              <w:t xml:space="preserve">_01</w:t>
+              <w:t xml:space="preserve">_01_data_setup_members.sql</w:t>
             </w:r>
           </w:p>
         </w:tc>
@@ -15203,7 +15203,7 @@
                 <w:sz w:val="20"/>
                 <w:szCs w:val="20"/>
               </w:rPr>
-              <w:t xml:space="preserve">SQL_PMA_rollup</w:t>
+              <w:t xml:space="preserve">SQL_PMA_rollup.sql</w:t>
             </w:r>
           </w:p>
         </w:tc>
@@ -15313,7 +15313,7 @@
                 <w:sz w:val="20"/>
                 <w:szCs w:val="20"/>
               </w:rPr>
-              <w:t xml:space="preserve">sql05</w:t>
+              <w:t xml:space="preserve">sql05_provider_pred_eval.sql</w:t>
             </w:r>
           </w:p>
         </w:tc>
@@ -15427,7 +15427,7 @@
                 <w:sz w:val="20"/>
                 <w:szCs w:val="20"/>
               </w:rPr>
-              <w:t xml:space="preserve">sql05</w:t>
+              <w:t xml:space="preserve">sql05_provider_pred_eval.sql</w:t>
             </w:r>
           </w:p>
         </w:tc>
@@ -15537,7 +15537,7 @@
                 <w:sz w:val="20"/>
                 <w:szCs w:val="20"/>
               </w:rPr>
-              <w:t xml:space="preserve">_03</w:t>
+              <w:t xml:space="preserve">_03_data_setup_qualified_visits.sql</w:t>
             </w:r>
           </w:p>
         </w:tc>
@@ -15651,7 +15651,7 @@
                 <w:sz w:val="20"/>
                 <w:szCs w:val="20"/>
               </w:rPr>
-              <w:t xml:space="preserve">Markov_score</w:t>
+              <w:t xml:space="preserve">Model_Markov_score.sql</w:t>
             </w:r>
           </w:p>
         </w:tc>
@@ -15761,7 +15761,7 @@
                 <w:sz w:val="20"/>
                 <w:szCs w:val="20"/>
               </w:rPr>
-              <w:t xml:space="preserve">_03</w:t>
+              <w:t xml:space="preserve">_03_data_setup_qualified_visits.sql</w:t>
             </w:r>
           </w:p>
         </w:tc>
@@ -15875,7 +15875,7 @@
                 <w:sz w:val="20"/>
                 <w:szCs w:val="20"/>
               </w:rPr>
-              <w:t xml:space="preserve">_03</w:t>
+              <w:t xml:space="preserve">_03_data_setup_qualified_visits.sql</w:t>
             </w:r>
           </w:p>
         </w:tc>
@@ -15985,7 +15985,7 @@
                 <w:sz w:val="20"/>
                 <w:szCs w:val="20"/>
               </w:rPr>
-              <w:t xml:space="preserve">03_cutoff</w:t>
+              <w:t xml:space="preserve">03_provider_transitions_and_cutoff.sql</w:t>
             </w:r>
           </w:p>
         </w:tc>
@@ -16099,7 +16099,7 @@
                 <w:sz w:val="20"/>
                 <w:szCs w:val="20"/>
               </w:rPr>
-              <w:t xml:space="preserve">nb05</w:t>
+              <w:t xml:space="preserve">nb05_Model_BERT4rec_provider.py</w:t>
             </w:r>
           </w:p>
         </w:tc>
@@ -16209,7 +16209,7 @@
                 <w:sz w:val="20"/>
                 <w:szCs w:val="20"/>
               </w:rPr>
-              <w:t xml:space="preserve">_02</w:t>
+              <w:t xml:space="preserve">_02_data_setup_visits.sql</w:t>
             </w:r>
           </w:p>
         </w:tc>
@@ -16323,7 +16323,7 @@
                 <w:sz w:val="20"/>
                 <w:szCs w:val="20"/>
               </w:rPr>
-              <w:t xml:space="preserve">Markov_score</w:t>
+              <w:t xml:space="preserve">Model_Markov_score.sql</w:t>
             </w:r>
           </w:p>
         </w:tc>
@@ -16433,7 +16433,7 @@
                 <w:sz w:val="20"/>
                 <w:szCs w:val="20"/>
               </w:rPr>
-              <w:t xml:space="preserve">EDA_penetration</w:t>
+              <w:t xml:space="preserve">EDA_penetration_file.sql</w:t>
             </w:r>
           </w:p>
         </w:tc>
@@ -16547,7 +16547,7 @@
                 <w:sz w:val="20"/>
                 <w:szCs w:val="20"/>
               </w:rPr>
-              <w:t xml:space="preserve">metrics_at_5</w:t>
+              <w:t xml:space="preserve">Model_metrics_at_5_comp.sql</w:t>
             </w:r>
           </w:p>
         </w:tc>
@@ -16657,7 +16657,7 @@
                 <w:sz w:val="20"/>
                 <w:szCs w:val="20"/>
               </w:rPr>
-              <w:t xml:space="preserve">SQL_PMA_rollup2</w:t>
+              <w:t xml:space="preserve">SQL_PMA_rollup2.sql</w:t>
             </w:r>
           </w:p>
         </w:tc>
@@ -16771,7 +16771,7 @@
                 <w:sz w:val="20"/>
                 <w:szCs w:val="20"/>
               </w:rPr>
-              <w:t xml:space="preserve">metrics_at_5</w:t>
+              <w:t xml:space="preserve">Model_metrics_at_5_comp.sql</w:t>
             </w:r>
           </w:p>
         </w:tc>
@@ -16881,7 +16881,7 @@
                 <w:sz w:val="20"/>
                 <w:szCs w:val="20"/>
               </w:rPr>
-              <w:t xml:space="preserve">sequence_data</w:t>
+              <w:t xml:space="preserve">model_input_sequence_data.sql</w:t>
             </w:r>
           </w:p>
         </w:tc>
@@ -16995,7 +16995,7 @@
                 <w:sz w:val="20"/>
                 <w:szCs w:val="20"/>
               </w:rPr>
-              <w:t xml:space="preserve">_03</w:t>
+              <w:t xml:space="preserve">_03_data_setup_qualified_visits.sql</w:t>
             </w:r>
           </w:p>
         </w:tc>
@@ -17105,7 +17105,7 @@
                 <w:sz w:val="20"/>
                 <w:szCs w:val="20"/>
               </w:rPr>
-              <w:t xml:space="preserve">_03</w:t>
+              <w:t xml:space="preserve">_03_data_setup_qualified_visits.sql</w:t>
             </w:r>
           </w:p>
         </w:tc>
@@ -17219,7 +17219,7 @@
                 <w:sz w:val="20"/>
                 <w:szCs w:val="20"/>
               </w:rPr>
-              <w:t xml:space="preserve">build_train</w:t>
+              <w:t xml:space="preserve">Model_build_train_dataset.py</w:t>
             </w:r>
           </w:p>
         </w:tc>
@@ -17329,7 +17329,7 @@
                 <w:sz w:val="20"/>
                 <w:szCs w:val="20"/>
               </w:rPr>
-              <w:t xml:space="preserve">_04</w:t>
+              <w:t xml:space="preserve">_04_visit_sequences.sql</w:t>
             </w:r>
           </w:p>
         </w:tc>
@@ -17443,7 +17443,7 @@
                 <w:sz w:val="20"/>
                 <w:szCs w:val="20"/>
               </w:rPr>
-              <w:t xml:space="preserve">sql05</w:t>
+              <w:t xml:space="preserve">sql05_provider_pred_eval.sql</w:t>
             </w:r>
           </w:p>
         </w:tc>
@@ -17553,7 +17553,7 @@
                 <w:sz w:val="20"/>
                 <w:szCs w:val="20"/>
               </w:rPr>
-              <w:t xml:space="preserve">Markov_train</w:t>
+              <w:t xml:space="preserve">Model_data_setup_01.sql</w:t>
             </w:r>
           </w:p>
         </w:tc>
@@ -17667,7 +17667,7 @@
                 <w:sz w:val="20"/>
                 <w:szCs w:val="20"/>
               </w:rPr>
-              <w:t xml:space="preserve">SQL_PMA_01</w:t>
+              <w:t xml:space="preserve">SQL_PMA_01_Transition_buckets_model_perf.sql</w:t>
             </w:r>
           </w:p>
         </w:tc>
@@ -17777,7 +17777,7 @@
                 <w:sz w:val="20"/>
                 <w:szCs w:val="20"/>
               </w:rPr>
-              <w:t xml:space="preserve">_02</w:t>
+              <w:t xml:space="preserve">_02_data_setup_visits.sql</w:t>
             </w:r>
           </w:p>
         </w:tc>
@@ -17891,7 +17891,7 @@
                 <w:sz w:val="20"/>
                 <w:szCs w:val="20"/>
               </w:rPr>
-              <w:t xml:space="preserve">EDA_entropy</w:t>
+              <w:t xml:space="preserve">EDA_input_target_unit_determination.sql</w:t>
             </w:r>
           </w:p>
         </w:tc>

</xml_diff>